<commit_message>
Docs: Update Docs and Links
</commit_message>
<xml_diff>
--- a/reports/Group/C3/00 - Requirements - Group.docx
+++ b/reports/Group/C3/00 - Requirements - Group.docx
@@ -4,7 +4,7 @@
   <w:body>
     <w:p>
       <w:pPr>
-        <w:pStyle w:val="Ttulo1"/>
+        <w:pStyle w:val="Heading1"/>
         <w:spacing w:before="0"/>
         <w:rPr>
           <w:rFonts w:cstheme="majorHAnsi"/>
@@ -91,7 +91,7 @@
           </w:tcPr>
           <w:p>
             <w:pPr>
-              <w:pStyle w:val="Sinespaciado"/>
+              <w:pStyle w:val="NoSpacing"/>
               <w:rPr>
                 <w:rFonts w:asciiTheme="majorHAnsi" w:hAnsiTheme="majorHAnsi" w:cstheme="majorHAnsi"/>
               </w:rPr>
@@ -194,7 +194,7 @@
           </w:tcPr>
           <w:p>
             <w:pPr>
-              <w:pStyle w:val="Sinespaciado"/>
+              <w:pStyle w:val="NoSpacing"/>
               <w:rPr>
                 <w:rFonts w:asciiTheme="majorHAnsi" w:hAnsiTheme="majorHAnsi" w:cstheme="majorHAnsi"/>
               </w:rPr>
@@ -282,7 +282,7 @@
           </w:p>
           <w:p>
             <w:pPr>
-              <w:pStyle w:val="Sinespaciado"/>
+              <w:pStyle w:val="NoSpacing"/>
               <w:rPr>
                 <w:rFonts w:asciiTheme="majorHAnsi" w:hAnsiTheme="majorHAnsi" w:cstheme="majorHAnsi"/>
                 <w:b/>
@@ -341,7 +341,7 @@
           <w:permEnd w:id="1331658018"/>
           <w:p>
             <w:pPr>
-              <w:pStyle w:val="Sinespaciado"/>
+              <w:pStyle w:val="NoSpacing"/>
               <w:rPr>
                 <w:rFonts w:asciiTheme="majorHAnsi" w:hAnsiTheme="majorHAnsi" w:cstheme="majorHAnsi"/>
                 <w:b/>
@@ -389,19 +389,11 @@
                   </w:rPr>
                   <w:t xml:space="preserve"> </w:t>
                 </w:r>
-                <w:proofErr w:type="spellStart"/>
                 <w:r>
                   <w:rPr>
                     <w:rFonts w:asciiTheme="majorHAnsi" w:hAnsiTheme="majorHAnsi" w:cstheme="majorHAnsi"/>
                   </w:rPr>
-                  <w:t>samtambal</w:t>
-                </w:r>
-                <w:proofErr w:type="spellEnd"/>
-                <w:r>
-                  <w:rPr>
-                    <w:rFonts w:asciiTheme="majorHAnsi" w:hAnsiTheme="majorHAnsi" w:cstheme="majorHAnsi"/>
-                  </w:rPr>
-                  <w:t xml:space="preserve"> </w:t>
+                  <w:t xml:space="preserve">samtambal </w:t>
                 </w:r>
               </w:sdtContent>
             </w:sdt>
@@ -409,7 +401,7 @@
           </w:p>
           <w:p>
             <w:pPr>
-              <w:pStyle w:val="Sinespaciado"/>
+              <w:pStyle w:val="NoSpacing"/>
               <w:rPr>
                 <w:rFonts w:asciiTheme="majorHAnsi" w:hAnsiTheme="majorHAnsi" w:cstheme="majorHAnsi"/>
               </w:rPr>
@@ -485,7 +477,7 @@
           </w:p>
           <w:p>
             <w:pPr>
-              <w:pStyle w:val="Sinespaciado"/>
+              <w:pStyle w:val="NoSpacing"/>
               <w:rPr>
                 <w:rFonts w:asciiTheme="majorHAnsi" w:hAnsiTheme="majorHAnsi" w:cstheme="majorHAnsi"/>
               </w:rPr>
@@ -560,7 +552,7 @@
           </w:tcPr>
           <w:p>
             <w:pPr>
-              <w:pStyle w:val="Sinespaciado"/>
+              <w:pStyle w:val="NoSpacing"/>
               <w:rPr>
                 <w:rFonts w:asciiTheme="majorHAnsi" w:hAnsiTheme="majorHAnsi" w:cstheme="majorHAnsi"/>
               </w:rPr>
@@ -582,7 +574,7 @@
           </w:tcPr>
           <w:p>
             <w:pPr>
-              <w:pStyle w:val="Sinespaciado"/>
+              <w:pStyle w:val="NoSpacing"/>
               <w:rPr>
                 <w:rFonts w:asciiTheme="majorHAnsi" w:hAnsiTheme="majorHAnsi" w:cstheme="majorHAnsi"/>
               </w:rPr>
@@ -638,7 +630,31 @@
                   <w:rPr>
                     <w:rFonts w:asciiTheme="majorHAnsi" w:hAnsiTheme="majorHAnsi" w:cstheme="majorHAnsi"/>
                   </w:rPr>
-                  <w:t>Seville, 19th September 2025</w:t>
+                  <w:t xml:space="preserve">Seville, </w:t>
+                </w:r>
+                <w:r>
+                  <w:rPr>
+                    <w:rFonts w:asciiTheme="majorHAnsi" w:hAnsiTheme="majorHAnsi" w:cstheme="majorHAnsi"/>
+                  </w:rPr>
+                  <w:t>16</w:t>
+                </w:r>
+                <w:r>
+                  <w:rPr>
+                    <w:rFonts w:asciiTheme="majorHAnsi" w:hAnsiTheme="majorHAnsi" w:cstheme="majorHAnsi"/>
+                  </w:rPr>
+                  <w:t xml:space="preserve">th </w:t>
+                </w:r>
+                <w:r>
+                  <w:rPr>
+                    <w:rFonts w:asciiTheme="majorHAnsi" w:hAnsiTheme="majorHAnsi" w:cstheme="majorHAnsi"/>
+                  </w:rPr>
+                  <w:t>October</w:t>
+                </w:r>
+                <w:r>
+                  <w:rPr>
+                    <w:rFonts w:asciiTheme="majorHAnsi" w:hAnsiTheme="majorHAnsi" w:cstheme="majorHAnsi"/>
+                  </w:rPr>
+                  <w:t xml:space="preserve"> 2025</w:t>
                 </w:r>
               </w:sdtContent>
             </w:sdt>
@@ -745,21 +761,7 @@
         <w:rPr>
           <w:lang w:val="es-ES"/>
         </w:rPr>
-        <w:t>¿Este error se debe a la organización en sí, o al tipo de archivos subidos? (.</w:t>
-      </w:r>
-      <w:proofErr w:type="spellStart"/>
-      <w:r>
-        <w:rPr>
-          <w:lang w:val="es-ES"/>
-        </w:rPr>
-        <w:t>pdf</w:t>
-      </w:r>
-      <w:proofErr w:type="spellEnd"/>
-      <w:r>
-        <w:rPr>
-          <w:lang w:val="es-ES"/>
-        </w:rPr>
-        <w:t>, .xlsx en algunos casos)</w:t>
+        <w:t>¿Este error se debe a la organización en sí, o al tipo de archivos subidos? (.pdf, .xlsx en algunos casos)</w:t>
       </w:r>
     </w:p>
     <w:p>
@@ -946,21 +948,7 @@
         <w:rPr>
           <w:lang w:val="es-ES_tradnl"/>
         </w:rPr>
-        <w:t xml:space="preserve">La estructura de carpetas puede que no sea correcta debido a la creación de subcarpetas dentro de las carpetas de cada estudiante (véase PC1 y PC2 en las carpetas del </w:t>
-      </w:r>
-      <w:proofErr w:type="spellStart"/>
-      <w:r>
-        <w:rPr>
-          <w:lang w:val="es-ES_tradnl"/>
-        </w:rPr>
-        <w:t>Student</w:t>
-      </w:r>
-      <w:proofErr w:type="spellEnd"/>
-      <w:r>
-        <w:rPr>
-          <w:lang w:val="es-ES_tradnl"/>
-        </w:rPr>
-        <w:t xml:space="preserve"> 4 y 5), pero no sabemos con certeza si ese es el problema con la organización, si es que existiera.</w:t>
+        <w:t>La estructura de carpetas puede que no sea correcta debido a la creación de subcarpetas dentro de las carpetas de cada estudiante (véase PC1 y PC2 en las carpetas del Student 4 y 5), pero no sabemos con certeza si ese es el problema con la organización, si es que existiera.</w:t>
       </w:r>
     </w:p>
     <w:p>
@@ -994,94 +982,52 @@
         <w:rPr>
           <w:lang w:val="es-ES"/>
         </w:rPr>
-        <w:t xml:space="preserve"> el comentario. Se ha revisado el documento “</w:t>
-      </w:r>
-      <w:proofErr w:type="spellStart"/>
+        <w:t xml:space="preserve"> el comentario. Se ha revisado el documento “On Your Deliverables” y se ha detectado que falta información </w:t>
+      </w:r>
       <w:r>
         <w:rPr>
           <w:lang w:val="es-ES"/>
         </w:rPr>
-        <w:t>On</w:t>
-      </w:r>
-      <w:proofErr w:type="spellEnd"/>
+        <w:t>en relación con</w:t>
+      </w:r>
       <w:r>
         <w:rPr>
           <w:lang w:val="es-ES"/>
         </w:rPr>
+        <w:t xml:space="preserve"> cómo organizar las carpetas por entregables.  </w:t>
+      </w:r>
+    </w:p>
+    <w:p>
+      <w:pPr>
+        <w:rPr>
+          <w:lang w:val="es-ES"/>
+        </w:rPr>
+      </w:pPr>
+    </w:p>
+    <w:p>
+      <w:pPr>
+        <w:pStyle w:val="Comment-Grader"/>
+        <w:rPr>
+          <w:lang w:val="es-ES"/>
+        </w:rPr>
+      </w:pPr>
+      <w:r>
+        <w:rPr>
+          <w:lang w:val="es-ES"/>
+        </w:rPr>
+        <w:t>RC: Revisado en C2.  OK.</w:t>
+      </w:r>
+      <w:r>
+        <w:rPr>
+          <w:lang w:val="es-ES"/>
+        </w:rPr>
         <w:t xml:space="preserve"> </w:t>
       </w:r>
-      <w:proofErr w:type="spellStart"/>
-      <w:r>
-        <w:rPr>
-          <w:lang w:val="es-ES"/>
-        </w:rPr>
-        <w:t>Your</w:t>
-      </w:r>
-      <w:proofErr w:type="spellEnd"/>
-      <w:r>
-        <w:rPr>
-          <w:lang w:val="es-ES"/>
-        </w:rPr>
-        <w:t xml:space="preserve"> </w:t>
-      </w:r>
-      <w:proofErr w:type="spellStart"/>
-      <w:r>
-        <w:rPr>
-          <w:lang w:val="es-ES"/>
-        </w:rPr>
-        <w:t>Deliverables</w:t>
-      </w:r>
-      <w:proofErr w:type="spellEnd"/>
-      <w:r>
-        <w:rPr>
-          <w:lang w:val="es-ES"/>
-        </w:rPr>
-        <w:t xml:space="preserve">” y se ha detectado que falta información </w:t>
-      </w:r>
-      <w:r>
-        <w:rPr>
-          <w:lang w:val="es-ES"/>
-        </w:rPr>
-        <w:t>en relación con</w:t>
-      </w:r>
-      <w:r>
-        <w:rPr>
-          <w:lang w:val="es-ES"/>
-        </w:rPr>
-        <w:t xml:space="preserve"> cómo organizar las carpetas por entregables.  </w:t>
-      </w:r>
-    </w:p>
-    <w:p>
-      <w:pPr>
-        <w:rPr>
-          <w:lang w:val="es-ES"/>
-        </w:rPr>
-      </w:pPr>
-    </w:p>
-    <w:p>
-      <w:pPr>
-        <w:pStyle w:val="Comment-Grader"/>
-        <w:rPr>
-          <w:lang w:val="es-ES"/>
-        </w:rPr>
-      </w:pPr>
-      <w:r>
-        <w:rPr>
-          <w:lang w:val="es-ES"/>
-        </w:rPr>
-        <w:t>RC: Revisado en C2.  OK.</w:t>
-      </w:r>
-      <w:r>
-        <w:rPr>
-          <w:lang w:val="es-ES"/>
-        </w:rPr>
-        <w:t xml:space="preserve"> </w:t>
-      </w:r>
     </w:p>
     <w:bookmarkEnd w:id="0"/>
     <w:p>
       <w:pPr>
-        <w:pStyle w:val="Ttulo1"/>
+        <w:pStyle w:val="Heading1"/>
         <w:spacing w:before="0"/>
         <w:rPr>
           <w:rFonts w:cstheme="majorHAnsi"/>
@@ -1115,7 +1061,7 @@
     </w:p>
     <w:p>
       <w:pPr>
-        <w:pStyle w:val="Ttulo2"/>
+        <w:pStyle w:val="Heading2"/>
         <w:rPr>
           <w:rFonts w:cstheme="majorHAnsi"/>
         </w:rPr>
@@ -1134,7 +1080,7 @@
     </w:p>
     <w:p>
       <w:pPr>
-        <w:pStyle w:val="Ttulo2"/>
+        <w:pStyle w:val="Heading2"/>
         <w:rPr>
           <w:rFonts w:cstheme="majorHAnsi"/>
         </w:rPr>
@@ -1153,7 +1099,7 @@
     </w:p>
     <w:p>
       <w:pPr>
-        <w:pStyle w:val="Ttulo2"/>
+        <w:pStyle w:val="Heading2"/>
         <w:rPr>
           <w:rFonts w:cstheme="majorHAnsi"/>
         </w:rPr>
@@ -1172,7 +1118,7 @@
     </w:p>
     <w:p>
       <w:pPr>
-        <w:pStyle w:val="Ttulo2"/>
+        <w:pStyle w:val="Heading2"/>
         <w:rPr>
           <w:rFonts w:cstheme="majorHAnsi"/>
         </w:rPr>
@@ -1191,7 +1137,7 @@
     </w:p>
     <w:p>
       <w:pPr>
-        <w:pStyle w:val="Ttulo2"/>
+        <w:pStyle w:val="Heading2"/>
         <w:rPr>
           <w:rFonts w:cstheme="majorHAnsi"/>
         </w:rPr>
@@ -1208,11 +1154,7 @@
         <w:pStyle w:val="Requirement-Header"/>
       </w:pPr>
       <w:r>
-        <w:t>Instantiate and customise the appropriate starter project so that you can work on this project.  Make sure that the name of your project folder, maven configuration (pom.xml), and database is “</w:t>
-      </w:r>
-      <w:proofErr w:type="spellStart"/>
-      <w:r>
-        <w:t>Acme-</w:t>
+        <w:t>Instantiate and customise the appropriate starter project so that you can work on this project.  Make sure that the name of your project folder, maven configuration (pom.xml), and database is “Acme-</w:t>
       </w:r>
       <w:r>
         <w:t>ANS</w:t>
@@ -1229,7 +1171,6 @@
       <w:r>
         <w:t>dd</w:t>
       </w:r>
-      <w:proofErr w:type="spellEnd"/>
       <w:r>
         <w:rPr>
           <w:rFonts w:ascii="Cambria Math" w:hAnsi="Cambria Math" w:cs="Cambria Math"/>
@@ -1378,12 +1319,10 @@
         <w:t xml:space="preserve">their </w:t>
       </w:r>
       <w:bookmarkStart w:id="4" w:name="_Int_4q4WObMb"/>
-      <w:proofErr w:type="gramStart"/>
       <w:r>
         <w:t>current status</w:t>
       </w:r>
       <w:bookmarkEnd w:id="4"/>
-      <w:proofErr w:type="gramEnd"/>
       <w:r>
         <w:t xml:space="preserve">, </w:t>
       </w:r>
@@ -1539,7 +1478,7 @@
       <w:hyperlink r:id="rId13" w:history="1">
         <w:r>
           <w:rPr>
-            <w:rStyle w:val="Hipervnculo"/>
+            <w:rStyle w:val="Hyperlink"/>
             <w:lang w:val="es-ES"/>
           </w:rPr>
           <w:t>https://github.com/users/FernandoTC18/projects/1/views/1?filterQuery=C2-G</w:t>
@@ -1652,104 +1591,61 @@
         <w:rPr>
           <w:lang w:val="es-ES"/>
         </w:rPr>
-        <w:t>Debido a que solo q</w:t>
-      </w:r>
-      <w:r>
+        <w:t>Solución aportada: Debido a que soy el último integrante del equipo original, no se van a crear tareas de coordinación, sino tareas de planificación de tareas. Se han creado debidamente tareas de preparación de entregas, pero de carácter individual.</w:t>
+      </w:r>
+    </w:p>
+    <w:p>
+      <w:pPr>
+        <w:pStyle w:val="Comment-Student"/>
         <w:rPr>
           <w:lang w:val="es-ES"/>
         </w:rPr>
-        <w:t>uedo yo</w:t>
-      </w:r>
+      </w:pPr>
       <w:r>
         <w:rPr>
           <w:lang w:val="es-ES"/>
         </w:rPr>
-        <w:t xml:space="preserve">, Samuel Tamayo </w:t>
-      </w:r>
-      <w:proofErr w:type="spellStart"/>
-      <w:r>
-        <w:rPr>
-          <w:lang w:val="es-ES"/>
-        </w:rPr>
-        <w:t>Balogh</w:t>
-      </w:r>
-      <w:proofErr w:type="spellEnd"/>
-      <w:r>
-        <w:rPr>
-          <w:lang w:val="es-ES"/>
-        </w:rPr>
-        <w:t>,</w:t>
-      </w:r>
-      <w:r>
-        <w:rPr>
-          <w:lang w:val="es-ES"/>
-        </w:rPr>
-        <w:t xml:space="preserve"> como único </w:t>
-      </w:r>
-      <w:r>
-        <w:rPr>
-          <w:lang w:val="es-ES"/>
-        </w:rPr>
-        <w:t>integrante del grupo</w:t>
-      </w:r>
-      <w:r>
-        <w:rPr>
-          <w:lang w:val="es-ES"/>
-        </w:rPr>
-        <w:t xml:space="preserve">, se ha solucionado creando </w:t>
-      </w:r>
-      <w:r>
-        <w:rPr>
-          <w:lang w:val="es-ES"/>
-        </w:rPr>
-        <w:t xml:space="preserve">una </w:t>
-      </w:r>
-      <w:r>
-        <w:rPr>
-          <w:lang w:val="es-ES"/>
-        </w:rPr>
-        <w:t xml:space="preserve">tarea específica </w:t>
-      </w:r>
-      <w:r>
-        <w:rPr>
-          <w:lang w:val="es-ES"/>
-        </w:rPr>
-        <w:t>de planificación de tareas</w:t>
-      </w:r>
-      <w:r>
-        <w:rPr>
-          <w:lang w:val="es-ES"/>
-        </w:rPr>
-        <w:t xml:space="preserve">, no así </w:t>
-      </w:r>
-      <w:r>
-        <w:rPr>
-          <w:lang w:val="es-ES"/>
-        </w:rPr>
-        <w:t>una</w:t>
-      </w:r>
-      <w:r>
-        <w:rPr>
-          <w:lang w:val="es-ES"/>
-        </w:rPr>
-        <w:t xml:space="preserve"> reunión</w:t>
-      </w:r>
-      <w:r>
-        <w:rPr>
-          <w:lang w:val="es-ES"/>
-        </w:rPr>
-        <w:t xml:space="preserve"> de coordinación</w:t>
-      </w:r>
-      <w:r>
-        <w:rPr>
-          <w:lang w:val="es-ES"/>
-        </w:rPr>
-        <w:t>.</w:t>
-      </w:r>
-    </w:p>
-    <w:p>
-      <w:pPr>
-        <w:pStyle w:val="Ttulo1"/>
+        <w:lastRenderedPageBreak/>
+        <w:drawing>
+          <wp:inline distT="0" distB="0" distL="0" distR="0" wp14:anchorId="4D5A3ACD" wp14:editId="042EA141">
+            <wp:extent cx="5731510" cy="3343910"/>
+            <wp:effectExtent l="0" t="0" r="2540" b="8890"/>
+            <wp:docPr id="308349086" name="Picture 1" descr="A screenshot of a chat&#10;&#10;AI-generated content may be incorrect."/>
+            <wp:cNvGraphicFramePr>
+              <a:graphicFrameLocks xmlns:a="http://schemas.openxmlformats.org/drawingml/2006/main" noChangeAspect="1"/>
+            </wp:cNvGraphicFramePr>
+            <a:graphic xmlns:a="http://schemas.openxmlformats.org/drawingml/2006/main">
+              <a:graphicData uri="http://schemas.openxmlformats.org/drawingml/2006/picture">
+                <pic:pic xmlns:pic="http://schemas.openxmlformats.org/drawingml/2006/picture">
+                  <pic:nvPicPr>
+                    <pic:cNvPr id="308349086" name="Picture 1" descr="A screenshot of a chat&#10;&#10;AI-generated content may be incorrect."/>
+                    <pic:cNvPicPr/>
+                  </pic:nvPicPr>
+                  <pic:blipFill>
+                    <a:blip r:embed="rId15"/>
+                    <a:stretch>
+                      <a:fillRect/>
+                    </a:stretch>
+                  </pic:blipFill>
+                  <pic:spPr>
+                    <a:xfrm>
+                      <a:off x="0" y="0"/>
+                      <a:ext cx="5731510" cy="3343910"/>
+                    </a:xfrm>
+                    <a:prstGeom prst="rect">
+                      <a:avLst/>
+                    </a:prstGeom>
+                  </pic:spPr>
+                </pic:pic>
+              </a:graphicData>
+            </a:graphic>
+          </wp:inline>
+        </w:drawing>
+      </w:r>
+    </w:p>
+    <w:p>
+      <w:pPr>
+        <w:pStyle w:val="Heading1"/>
         <w:rPr>
           <w:rFonts w:cstheme="majorHAnsi"/>
           <w:lang w:val="en-US"/>
@@ -1787,7 +1683,7 @@
     </w:p>
     <w:p>
       <w:pPr>
-        <w:pStyle w:val="Ttulo2"/>
+        <w:pStyle w:val="Heading2"/>
         <w:rPr>
           <w:rFonts w:cstheme="majorHAnsi"/>
         </w:rPr>
@@ -1939,26 +1835,13 @@
       <w:bookmarkStart w:id="5" w:name="OLE_LINK1"/>
       <w:bookmarkStart w:id="6" w:name="OLE_LINK2"/>
       <w:r>
-        <w:t>(pattern " ^\</w:t>
-      </w:r>
-      <w:proofErr w:type="gramStart"/>
-      <w:r>
-        <w:t>+?\d{</w:t>
-      </w:r>
-      <w:proofErr w:type="gramEnd"/>
+        <w:t>(pattern " ^\+?\d{</w:t>
+      </w:r>
       <w:r>
         <w:t>6</w:t>
       </w:r>
       <w:r>
-        <w:t>,</w:t>
-      </w:r>
-      <w:proofErr w:type="gramStart"/>
-      <w:r>
-        <w:t>15}$</w:t>
-      </w:r>
-      <w:proofErr w:type="gramEnd"/>
-      <w:r>
-        <w:t>")</w:t>
+        <w:t>,15}$")</w:t>
       </w:r>
       <w:bookmarkEnd w:id="5"/>
       <w:bookmarkEnd w:id="6"/>
@@ -2844,7 +2727,7 @@
     </w:p>
     <w:p>
       <w:pPr>
-        <w:pStyle w:val="Ttulo2"/>
+        <w:pStyle w:val="Heading2"/>
         <w:rPr>
           <w:rFonts w:cstheme="majorHAnsi"/>
         </w:rPr>
@@ -2863,7 +2746,7 @@
     </w:p>
     <w:p>
       <w:pPr>
-        <w:pStyle w:val="Ttulo2"/>
+        <w:pStyle w:val="Heading2"/>
         <w:rPr>
           <w:rFonts w:cstheme="majorHAnsi"/>
         </w:rPr>
@@ -2882,7 +2765,7 @@
     </w:p>
     <w:p>
       <w:pPr>
-        <w:pStyle w:val="Ttulo2"/>
+        <w:pStyle w:val="Heading2"/>
         <w:rPr>
           <w:rFonts w:cstheme="majorHAnsi"/>
         </w:rPr>
@@ -2978,7 +2861,7 @@
     </w:p>
     <w:p>
       <w:pPr>
-        <w:pStyle w:val="Ttulo2"/>
+        <w:pStyle w:val="Heading2"/>
         <w:rPr>
           <w:rFonts w:cstheme="majorHAnsi"/>
         </w:rPr>
@@ -3013,13 +2896,8 @@
         <w:t xml:space="preserve">, </w:t>
       </w:r>
       <w:r>
-        <w:t xml:space="preserve">their </w:t>
-      </w:r>
-      <w:proofErr w:type="gramStart"/>
-      <w:r>
-        <w:t>current status</w:t>
-      </w:r>
-      <w:proofErr w:type="gramEnd"/>
+        <w:t>their current status</w:t>
+      </w:r>
       <w:r>
         <w:t>, and your schedule</w:t>
       </w:r>
@@ -3061,7 +2939,7 @@
     </w:p>
     <w:p>
       <w:pPr>
-        <w:pStyle w:val="Ttulo1"/>
+        <w:pStyle w:val="Heading1"/>
         <w:tabs>
           <w:tab w:val="left" w:pos="284"/>
         </w:tabs>
@@ -3097,7 +2975,7 @@
     </w:p>
     <w:p>
       <w:pPr>
-        <w:pStyle w:val="Ttulo2"/>
+        <w:pStyle w:val="Heading2"/>
         <w:rPr>
           <w:rFonts w:cstheme="majorHAnsi"/>
         </w:rPr>
@@ -3116,7 +2994,7 @@
     </w:p>
     <w:p>
       <w:pPr>
-        <w:pStyle w:val="Ttulo2"/>
+        <w:pStyle w:val="Heading2"/>
         <w:rPr>
           <w:rFonts w:cstheme="majorHAnsi"/>
         </w:rPr>
@@ -3489,7 +3367,7 @@
     </w:p>
     <w:p>
       <w:pPr>
-        <w:pStyle w:val="Ttulo2"/>
+        <w:pStyle w:val="Heading2"/>
         <w:rPr>
           <w:rFonts w:cstheme="majorHAnsi"/>
         </w:rPr>
@@ -3516,7 +3394,7 @@
     </w:p>
     <w:p>
       <w:pPr>
-        <w:pStyle w:val="Ttulo2"/>
+        <w:pStyle w:val="Heading2"/>
         <w:rPr>
           <w:rFonts w:cstheme="majorHAnsi"/>
         </w:rPr>
@@ -3535,7 +3413,7 @@
     </w:p>
     <w:p>
       <w:pPr>
-        <w:pStyle w:val="Ttulo2"/>
+        <w:pStyle w:val="Heading2"/>
         <w:rPr>
           <w:rFonts w:cstheme="majorHAnsi"/>
         </w:rPr>
@@ -3553,15 +3431,7 @@
         <w:pStyle w:val="Requirement-Header"/>
       </w:pPr>
       <w:r>
-        <w:t xml:space="preserve">Provide a link to your planning dashboard in GitHub to review the tasks, their </w:t>
-      </w:r>
-      <w:proofErr w:type="gramStart"/>
-      <w:r>
-        <w:t>current status</w:t>
-      </w:r>
-      <w:proofErr w:type="gramEnd"/>
-      <w:r>
-        <w:t>, and your schedule.</w:t>
+        <w:t>Provide a link to your planning dashboard in GitHub to review the tasks, their current status, and your schedule.</w:t>
       </w:r>
     </w:p>
     <w:permStart w:id="1902000534" w:edGrp="everyone"/>
@@ -3650,7 +3520,21 @@
     </w:p>
     <w:p>
       <w:pPr>
-        <w:pStyle w:val="Ttulo1"/>
+        <w:pStyle w:val="Comment-Student"/>
+        <w:rPr>
+          <w:lang w:val="es-ES"/>
+        </w:rPr>
+      </w:pPr>
+      <w:r>
+        <w:rPr>
+          <w:lang w:val="es-ES"/>
+        </w:rPr>
+        <w:t>Solución aportada: Debido a que soy el último integrante del equipo original, no se van a crear tareas de coordinación, sino tareas de planificación de tareas. Se han creado debidamente tareas de preparación de entregas, pero de carácter individual.</w:t>
+      </w:r>
+    </w:p>
+    <w:p>
+      <w:pPr>
+        <w:pStyle w:val="Heading1"/>
         <w:tabs>
           <w:tab w:val="left" w:pos="284"/>
         </w:tabs>
@@ -3686,7 +3570,7 @@
     </w:p>
     <w:p>
       <w:pPr>
-        <w:pStyle w:val="Ttulo2"/>
+        <w:pStyle w:val="Heading2"/>
         <w:rPr>
           <w:rFonts w:cstheme="majorHAnsi"/>
         </w:rPr>
@@ -3737,21 +3621,8 @@
       <w:r>
         <w:t xml:space="preserve">   </w:t>
       </w:r>
-      <w:proofErr w:type="spellStart"/>
-      <w:r>
-        <w:t>Índices</w:t>
-      </w:r>
-      <w:proofErr w:type="spellEnd"/>
-      <w:r>
-        <w:t xml:space="preserve"> </w:t>
-      </w:r>
-      <w:proofErr w:type="spellStart"/>
-      <w:r>
-        <w:t>duplicados</w:t>
-      </w:r>
-      <w:proofErr w:type="spellEnd"/>
-      <w:r>
-        <w:t>:</w:t>
+      <w:r>
+        <w:t>Índices duplicados:</w:t>
       </w:r>
     </w:p>
     <w:p>
@@ -3778,7 +3649,7 @@
                     <pic:cNvPicPr/>
                   </pic:nvPicPr>
                   <pic:blipFill>
-                    <a:blip r:embed="rId15"/>
+                    <a:blip r:embed="rId16"/>
                     <a:stretch>
                       <a:fillRect/>
                     </a:stretch>
@@ -3823,7 +3694,7 @@
                     <pic:cNvPicPr/>
                   </pic:nvPicPr>
                   <pic:blipFill>
-                    <a:blip r:embed="rId16"/>
+                    <a:blip r:embed="rId17"/>
                     <a:stretch>
                       <a:fillRect/>
                     </a:stretch>
@@ -3874,7 +3745,7 @@
                     <pic:cNvPicPr/>
                   </pic:nvPicPr>
                   <pic:blipFill>
-                    <a:blip r:embed="rId17"/>
+                    <a:blip r:embed="rId18"/>
                     <a:stretch>
                       <a:fillRect/>
                     </a:stretch>
@@ -3926,21 +3797,21 @@
         <w:rPr>
           <w:lang w:val="es-ES_tradnl"/>
         </w:rPr>
-        <w:t>Alternativa 1: Al estar anotado con @</w:t>
-      </w:r>
-      <w:proofErr w:type="gramStart"/>
-      <w:r>
+        <w:t>Alternativa 1: Al estar anotado con @Column(unique = true), no es necesario crear ese índice, ya que se crea de manera automática. La solución consistiría en eliminar la anotación @Table</w:t>
+      </w:r>
+    </w:p>
+    <w:p>
+      <w:pPr>
+        <w:pStyle w:val="Comment-Student"/>
         <w:rPr>
           <w:lang w:val="es-ES_tradnl"/>
         </w:rPr>
-        <w:t>Column(</w:t>
-      </w:r>
-      <w:proofErr w:type="gramEnd"/>
+      </w:pPr>
       <w:r>
         <w:rPr>
           <w:lang w:val="es-ES_tradnl"/>
         </w:rPr>
-        <w:t>unique = true), no es necesario crear ese índice, ya que se crea de manera automática. La solución consistiría en eliminar la anotación @Table</w:t>
+        <w:t>Ventajas de la alternativa 1: sería fácil de corregir, ya que simplemente sería eliminar el código de creación del índice</w:t>
       </w:r>
     </w:p>
     <w:p>
@@ -3954,37 +3825,7 @@
         <w:rPr>
           <w:lang w:val="es-ES_tradnl"/>
         </w:rPr>
-        <w:t>Ventajas de la alternativa 1: sería fácil de corregir, ya que simplemente sería eliminar el código de creación del índice</w:t>
-      </w:r>
-    </w:p>
-    <w:p>
-      <w:pPr>
-        <w:pStyle w:val="Comment-Student"/>
-        <w:rPr>
-          <w:lang w:val="es-ES_tradnl"/>
-        </w:rPr>
-      </w:pPr>
-      <w:r>
-        <w:rPr>
-          <w:lang w:val="es-ES_tradnl"/>
-        </w:rPr>
-        <w:t xml:space="preserve">Desventajas la alternativa 1: ni en las presentaciones de la asignatura ni en la documentación oficial de </w:t>
-      </w:r>
-      <w:proofErr w:type="spellStart"/>
-      <w:proofErr w:type="gramStart"/>
-      <w:r>
-        <w:rPr>
-          <w:lang w:val="es-ES_tradnl"/>
-        </w:rPr>
-        <w:t>javax.persistence</w:t>
-      </w:r>
-      <w:proofErr w:type="spellEnd"/>
-      <w:proofErr w:type="gramEnd"/>
-      <w:r>
-        <w:rPr>
-          <w:lang w:val="es-ES_tradnl"/>
-        </w:rPr>
-        <w:t xml:space="preserve"> se da a entender que dicha anotación </w:t>
+        <w:t xml:space="preserve">Desventajas la alternativa 1: ni en las presentaciones de la asignatura ni en la documentación oficial de javax.persistence se da a entender que dicha anotación </w:t>
       </w:r>
       <w:r>
         <w:rPr>
@@ -4070,21 +3911,7 @@
         <w:rPr>
           <w:lang w:val="es-ES_tradnl"/>
         </w:rPr>
-        <w:t xml:space="preserve">Solución propuesta: Tras comentar la anotación @Table y comprobar manualmente en </w:t>
-      </w:r>
-      <w:proofErr w:type="spellStart"/>
-      <w:r>
-        <w:rPr>
-          <w:lang w:val="es-ES_tradnl"/>
-        </w:rPr>
-        <w:t>DBeaver</w:t>
-      </w:r>
-      <w:proofErr w:type="spellEnd"/>
-      <w:r>
-        <w:rPr>
-          <w:lang w:val="es-ES_tradnl"/>
-        </w:rPr>
-        <w:t xml:space="preserve"> ejecutando la consulta SQL </w:t>
+        <w:t xml:space="preserve">Solución propuesta: Tras comentar la anotación @Table y comprobar manualmente en DBeaver ejecutando la consulta SQL </w:t>
       </w:r>
       <w:r>
         <w:rPr>
@@ -4112,35 +3939,7 @@
         <w:rPr>
           <w:lang w:val="es-ES_tradnl"/>
         </w:rPr>
-        <w:t>.airport</w:t>
-      </w:r>
-      <w:proofErr w:type="gramStart"/>
-      <w:r>
-        <w:rPr>
-          <w:lang w:val="es-ES_tradnl"/>
-        </w:rPr>
-        <w:t>; ,</w:t>
-      </w:r>
-      <w:proofErr w:type="gramEnd"/>
-      <w:r>
-        <w:rPr>
-          <w:lang w:val="es-ES_tradnl"/>
-        </w:rPr>
-        <w:t xml:space="preserve"> vemos que </w:t>
-      </w:r>
-      <w:proofErr w:type="spellStart"/>
-      <w:r>
-        <w:rPr>
-          <w:lang w:val="es-ES_tradnl"/>
-        </w:rPr>
-        <w:t>MariaDB</w:t>
-      </w:r>
-      <w:proofErr w:type="spellEnd"/>
-      <w:r>
-        <w:rPr>
-          <w:lang w:val="es-ES_tradnl"/>
-        </w:rPr>
-        <w:t xml:space="preserve"> crea automáticamente ese índice. Así que nos decantamos por la alternativa 1</w:t>
+        <w:t>.airport; , vemos que MariaDB crea automáticamente ese índice. Así que nos decantamos por la alternativa 1</w:t>
       </w:r>
     </w:p>
     <w:p>
@@ -4154,21 +3953,7 @@
         <w:rPr>
           <w:lang w:val="es-ES"/>
         </w:rPr>
-        <w:t xml:space="preserve">RC: Al declarar un atributo como único </w:t>
-      </w:r>
-      <w:proofErr w:type="spellStart"/>
-      <w:r>
-        <w:rPr>
-          <w:lang w:val="es-ES"/>
-        </w:rPr>
-        <w:t>MariaBD</w:t>
-      </w:r>
-      <w:proofErr w:type="spellEnd"/>
-      <w:r>
-        <w:rPr>
-          <w:lang w:val="es-ES"/>
-        </w:rPr>
-        <w:t xml:space="preserve"> implementa automáticamente un índice para acelerar las consultas sobre el mismo. </w:t>
+        <w:t xml:space="preserve">RC: Al declarar un atributo como único MariaBD implementa automáticamente un índice para acelerar las consultas sobre el mismo. </w:t>
       </w:r>
       <w:r>
         <w:rPr>
@@ -4203,26 +3988,12 @@
         <w:rPr>
           <w:lang w:val="en-US"/>
         </w:rPr>
-        <w:t xml:space="preserve">RC: </w:t>
-      </w:r>
-      <w:proofErr w:type="spellStart"/>
-      <w:r>
-        <w:rPr>
-          <w:lang w:val="en-US"/>
-        </w:rPr>
-        <w:t>Revisado</w:t>
-      </w:r>
-      <w:proofErr w:type="spellEnd"/>
-      <w:r>
-        <w:rPr>
-          <w:lang w:val="en-US"/>
-        </w:rPr>
-        <w:t>. OK.</w:t>
-      </w:r>
-    </w:p>
-    <w:p>
-      <w:pPr>
-        <w:pStyle w:val="Ttulo2"/>
+        <w:t>RC: Revisado. OK.</w:t>
+      </w:r>
+    </w:p>
+    <w:p>
+      <w:pPr>
+        <w:pStyle w:val="Heading2"/>
         <w:rPr>
           <w:rFonts w:cstheme="majorHAnsi"/>
         </w:rPr>
@@ -4241,7 +4012,7 @@
     </w:p>
     <w:p>
       <w:pPr>
-        <w:pStyle w:val="Ttulo2"/>
+        <w:pStyle w:val="Heading2"/>
         <w:rPr>
           <w:rFonts w:cstheme="majorHAnsi"/>
         </w:rPr>
@@ -4260,7 +4031,7 @@
     </w:p>
     <w:p>
       <w:pPr>
-        <w:pStyle w:val="Ttulo2"/>
+        <w:pStyle w:val="Heading2"/>
         <w:rPr>
           <w:rFonts w:cstheme="majorHAnsi"/>
         </w:rPr>
@@ -4320,7 +4091,7 @@
     </w:p>
     <w:p>
       <w:pPr>
-        <w:pStyle w:val="Ttulo2"/>
+        <w:pStyle w:val="Heading2"/>
         <w:rPr>
           <w:rFonts w:cstheme="majorHAnsi"/>
         </w:rPr>
@@ -4337,15 +4108,7 @@
         <w:pStyle w:val="Requirement-Header"/>
       </w:pPr>
       <w:r>
-        <w:t xml:space="preserve">Provide a link to your planning dashboard in GitHub to review the tasks, their </w:t>
-      </w:r>
-      <w:proofErr w:type="gramStart"/>
-      <w:r>
-        <w:t>current status</w:t>
-      </w:r>
-      <w:proofErr w:type="gramEnd"/>
-      <w:r>
-        <w:t>, and your schedule.</w:t>
+        <w:t>Provide a link to your planning dashboard in GitHub to review the tasks, their current status, and your schedule.</w:t>
       </w:r>
       <w:r>
         <w:t xml:space="preserve">  </w:t>
@@ -4437,6 +4200,20 @@
     </w:p>
     <w:p>
       <w:pPr>
+        <w:pStyle w:val="Comment-Student"/>
+        <w:rPr>
+          <w:lang w:val="es-ES"/>
+        </w:rPr>
+      </w:pPr>
+      <w:r>
+        <w:rPr>
+          <w:lang w:val="es-ES"/>
+        </w:rPr>
+        <w:t>Solución aportada: Debido a que soy el último integrante del equipo original, no se van a crear tareas de coordinación, sino tareas de planificación de tareas. Se han creado debidamente tareas de preparación de entregas, pero de carácter individual.</w:t>
+      </w:r>
+    </w:p>
+    <w:p>
+      <w:pPr>
         <w:pStyle w:val="Requirement-Body"/>
         <w:numPr>
           <w:ilvl w:val="0"/>
@@ -4508,7 +4285,7 @@
     </w:p>
     <w:p>
       <w:pPr>
-        <w:pStyle w:val="Ttulo1"/>
+        <w:pStyle w:val="Heading1"/>
         <w:tabs>
           <w:tab w:val="left" w:pos="284"/>
         </w:tabs>
@@ -4544,7 +4321,7 @@
     </w:p>
     <w:p>
       <w:pPr>
-        <w:pStyle w:val="Ttulo2"/>
+        <w:pStyle w:val="Heading2"/>
         <w:rPr>
           <w:rFonts w:cstheme="majorHAnsi"/>
         </w:rPr>
@@ -4569,7 +4346,7 @@
     </w:p>
     <w:p>
       <w:pPr>
-        <w:pStyle w:val="Ttulo2"/>
+        <w:pStyle w:val="Heading2"/>
         <w:rPr>
           <w:rFonts w:cstheme="majorHAnsi"/>
         </w:rPr>
@@ -4594,7 +4371,7 @@
     </w:p>
     <w:p>
       <w:pPr>
-        <w:pStyle w:val="Ttulo2"/>
+        <w:pStyle w:val="Heading2"/>
         <w:rPr>
           <w:rFonts w:cstheme="majorHAnsi"/>
         </w:rPr>
@@ -4681,7 +4458,7 @@
     </w:p>
     <w:p>
       <w:pPr>
-        <w:pStyle w:val="Ttulo2"/>
+        <w:pStyle w:val="Heading2"/>
         <w:rPr>
           <w:rFonts w:cstheme="majorHAnsi"/>
         </w:rPr>
@@ -4706,7 +4483,7 @@
     </w:p>
     <w:p>
       <w:pPr>
-        <w:pStyle w:val="Ttulo2"/>
+        <w:pStyle w:val="Heading2"/>
         <w:rPr>
           <w:rFonts w:cstheme="majorHAnsi"/>
         </w:rPr>
@@ -4837,7 +4614,7 @@
     </w:p>
     <w:p>
       <w:pPr>
-        <w:pStyle w:val="Ttulo1"/>
+        <w:pStyle w:val="Heading1"/>
         <w:tabs>
           <w:tab w:val="left" w:pos="284"/>
         </w:tabs>
@@ -4873,7 +4650,7 @@
     </w:p>
     <w:p>
       <w:pPr>
-        <w:pStyle w:val="Ttulo2"/>
+        <w:pStyle w:val="Heading2"/>
         <w:rPr>
           <w:rFonts w:cstheme="majorHAnsi"/>
         </w:rPr>
@@ -5087,7 +4864,7 @@
     </w:p>
     <w:p>
       <w:pPr>
-        <w:pStyle w:val="Ttulo2"/>
+        <w:pStyle w:val="Heading2"/>
         <w:rPr>
           <w:rFonts w:cstheme="majorHAnsi"/>
         </w:rPr>
@@ -5112,7 +4889,7 @@
     </w:p>
     <w:p>
       <w:pPr>
-        <w:pStyle w:val="Ttulo2"/>
+        <w:pStyle w:val="Heading2"/>
         <w:rPr>
           <w:rFonts w:cstheme="majorHAnsi"/>
         </w:rPr>
@@ -5137,7 +4914,7 @@
     </w:p>
     <w:p>
       <w:pPr>
-        <w:pStyle w:val="Ttulo2"/>
+        <w:pStyle w:val="Heading2"/>
         <w:rPr>
           <w:rFonts w:cstheme="majorHAnsi"/>
         </w:rPr>
@@ -5162,7 +4939,7 @@
     </w:p>
     <w:p>
       <w:pPr>
-        <w:pStyle w:val="Ttulo2"/>
+        <w:pStyle w:val="Heading2"/>
         <w:rPr>
           <w:rFonts w:cstheme="majorHAnsi"/>
         </w:rPr>
@@ -5217,7 +4994,7 @@
     <w:p/>
     <w:p>
       <w:pPr>
-        <w:pStyle w:val="Ttulo1"/>
+        <w:pStyle w:val="Heading1"/>
         <w:tabs>
           <w:tab w:val="left" w:pos="284"/>
         </w:tabs>
@@ -5253,7 +5030,7 @@
     </w:p>
     <w:p>
       <w:pPr>
-        <w:pStyle w:val="Ttulo2"/>
+        <w:pStyle w:val="Heading2"/>
         <w:rPr>
           <w:rFonts w:cstheme="majorHAnsi"/>
         </w:rPr>
@@ -5278,7 +5055,7 @@
     </w:p>
     <w:p>
       <w:pPr>
-        <w:pStyle w:val="Ttulo2"/>
+        <w:pStyle w:val="Heading2"/>
         <w:rPr>
           <w:rFonts w:cstheme="majorHAnsi"/>
         </w:rPr>
@@ -5700,7 +5477,7 @@
     <w:bookmarkEnd w:id="7"/>
     <w:p>
       <w:pPr>
-        <w:pStyle w:val="Ttulo2"/>
+        <w:pStyle w:val="Heading2"/>
         <w:rPr>
           <w:rFonts w:cstheme="majorHAnsi"/>
         </w:rPr>
@@ -5776,7 +5553,7 @@
     </w:p>
     <w:p>
       <w:pPr>
-        <w:pStyle w:val="Ttulo2"/>
+        <w:pStyle w:val="Heading2"/>
         <w:rPr>
           <w:rFonts w:cstheme="majorHAnsi"/>
         </w:rPr>
@@ -5801,7 +5578,7 @@
     </w:p>
     <w:p>
       <w:pPr>
-        <w:pStyle w:val="Ttulo2"/>
+        <w:pStyle w:val="Heading2"/>
         <w:rPr>
           <w:rFonts w:cstheme="majorHAnsi"/>
         </w:rPr>
@@ -5876,7 +5653,7 @@
     </w:p>
     <w:p>
       <w:pPr>
-        <w:pStyle w:val="Ttulo1"/>
+        <w:pStyle w:val="Heading1"/>
       </w:pPr>
       <w:r>
         <w:lastRenderedPageBreak/>
@@ -5894,7 +5671,7 @@
     </w:p>
     <w:p>
       <w:pPr>
-        <w:pStyle w:val="Ttulo2"/>
+        <w:pStyle w:val="Heading2"/>
         <w:rPr>
           <w:rFonts w:cstheme="majorHAnsi"/>
         </w:rPr>
@@ -5919,7 +5696,7 @@
     </w:p>
     <w:p>
       <w:pPr>
-        <w:pStyle w:val="Ttulo2"/>
+        <w:pStyle w:val="Heading2"/>
         <w:rPr>
           <w:rFonts w:cstheme="majorHAnsi"/>
         </w:rPr>
@@ -5944,7 +5721,7 @@
     </w:p>
     <w:p>
       <w:pPr>
-        <w:pStyle w:val="Ttulo2"/>
+        <w:pStyle w:val="Heading2"/>
         <w:rPr>
           <w:rFonts w:cstheme="majorHAnsi"/>
         </w:rPr>
@@ -5969,7 +5746,7 @@
     </w:p>
     <w:p>
       <w:pPr>
-        <w:pStyle w:val="Ttulo2"/>
+        <w:pStyle w:val="Heading2"/>
         <w:rPr>
           <w:rFonts w:cstheme="majorHAnsi"/>
         </w:rPr>
@@ -6029,7 +5806,7 @@
     </w:p>
     <w:p>
       <w:pPr>
-        <w:pStyle w:val="Ttulo2"/>
+        <w:pStyle w:val="Heading2"/>
         <w:rPr>
           <w:rFonts w:cstheme="majorHAnsi"/>
         </w:rPr>
@@ -6082,7 +5859,7 @@
     </w:p>
     <w:p>
       <w:pPr>
-        <w:pStyle w:val="Ttulo1"/>
+        <w:pStyle w:val="Heading1"/>
         <w:tabs>
           <w:tab w:val="left" w:pos="284"/>
         </w:tabs>
@@ -6118,7 +5895,7 @@
     </w:p>
     <w:p>
       <w:pPr>
-        <w:pStyle w:val="Ttulo2"/>
+        <w:pStyle w:val="Heading2"/>
         <w:rPr>
           <w:rFonts w:cstheme="majorHAnsi"/>
         </w:rPr>
@@ -6143,7 +5920,7 @@
     </w:p>
     <w:p>
       <w:pPr>
-        <w:pStyle w:val="Ttulo2"/>
+        <w:pStyle w:val="Heading2"/>
         <w:rPr>
           <w:rFonts w:cstheme="majorHAnsi"/>
         </w:rPr>
@@ -6168,7 +5945,7 @@
     </w:p>
     <w:p>
       <w:pPr>
-        <w:pStyle w:val="Ttulo2"/>
+        <w:pStyle w:val="Heading2"/>
         <w:rPr>
           <w:rFonts w:cstheme="majorHAnsi"/>
         </w:rPr>
@@ -6193,7 +5970,7 @@
     </w:p>
     <w:p>
       <w:pPr>
-        <w:pStyle w:val="Ttulo2"/>
+        <w:pStyle w:val="Heading2"/>
         <w:rPr>
           <w:rFonts w:cstheme="majorHAnsi"/>
         </w:rPr>
@@ -6218,7 +5995,7 @@
     </w:p>
     <w:p>
       <w:pPr>
-        <w:pStyle w:val="Ttulo2"/>
+        <w:pStyle w:val="Heading2"/>
         <w:rPr>
           <w:rFonts w:cstheme="majorHAnsi"/>
         </w:rPr>
@@ -6306,7 +6083,7 @@
     </w:p>
     <w:p>
       <w:pPr>
-        <w:pStyle w:val="Ttulo1"/>
+        <w:pStyle w:val="Heading1"/>
         <w:tabs>
           <w:tab w:val="left" w:pos="284"/>
         </w:tabs>
@@ -6342,7 +6119,7 @@
     </w:p>
     <w:p>
       <w:pPr>
-        <w:pStyle w:val="Ttulo2"/>
+        <w:pStyle w:val="Heading2"/>
         <w:rPr>
           <w:rFonts w:cstheme="majorHAnsi"/>
         </w:rPr>
@@ -6536,7 +6313,7 @@
     </w:p>
     <w:p>
       <w:pPr>
-        <w:pStyle w:val="Ttulo2"/>
+        <w:pStyle w:val="Heading2"/>
         <w:rPr>
           <w:rFonts w:cstheme="majorHAnsi"/>
         </w:rPr>
@@ -6561,7 +6338,7 @@
     </w:p>
     <w:p>
       <w:pPr>
-        <w:pStyle w:val="Ttulo2"/>
+        <w:pStyle w:val="Heading2"/>
         <w:rPr>
           <w:rFonts w:cstheme="majorHAnsi"/>
         </w:rPr>
@@ -6628,7 +6405,7 @@
     </w:p>
     <w:p>
       <w:pPr>
-        <w:pStyle w:val="Ttulo2"/>
+        <w:pStyle w:val="Heading2"/>
         <w:rPr>
           <w:rFonts w:cstheme="majorHAnsi"/>
         </w:rPr>
@@ -6653,7 +6430,7 @@
     </w:p>
     <w:p>
       <w:pPr>
-        <w:pStyle w:val="Ttulo2"/>
+        <w:pStyle w:val="Heading2"/>
         <w:rPr>
           <w:rFonts w:cstheme="majorHAnsi"/>
         </w:rPr>
@@ -6735,7 +6512,7 @@
     </w:p>
     <w:p>
       <w:pPr>
-        <w:pStyle w:val="Ttulo1"/>
+        <w:pStyle w:val="Heading1"/>
         <w:tabs>
           <w:tab w:val="left" w:pos="284"/>
         </w:tabs>
@@ -6771,7 +6548,7 @@
     </w:p>
     <w:p>
       <w:pPr>
-        <w:pStyle w:val="Ttulo2"/>
+        <w:pStyle w:val="Heading2"/>
         <w:rPr>
           <w:rFonts w:cstheme="majorHAnsi"/>
         </w:rPr>
@@ -6796,7 +6573,7 @@
     </w:p>
     <w:p>
       <w:pPr>
-        <w:pStyle w:val="Ttulo2"/>
+        <w:pStyle w:val="Heading2"/>
         <w:rPr>
           <w:rFonts w:cstheme="majorHAnsi"/>
         </w:rPr>
@@ -7016,7 +6793,7 @@
     </w:p>
     <w:p>
       <w:pPr>
-        <w:pStyle w:val="Ttulo2"/>
+        <w:pStyle w:val="Heading2"/>
         <w:rPr>
           <w:rFonts w:cstheme="majorHAnsi"/>
         </w:rPr>
@@ -7097,158 +6874,241 @@
         <w:t>,</w:t>
       </w:r>
       <w:r>
+        <w:t xml:space="preserve"> “viagra”</w:t>
+      </w:r>
+      <w:r>
+        <w:t>,</w:t>
+      </w:r>
+      <w:r>
+        <w:t xml:space="preserve"> “cialis”</w:t>
+      </w:r>
+      <w:r>
+        <w:t>,</w:t>
+      </w:r>
+      <w:r>
+        <w:t xml:space="preserve"> “one million”</w:t>
+      </w:r>
+      <w:r>
+        <w:t>,</w:t>
+      </w:r>
+      <w:r>
+        <w:t xml:space="preserve"> “you’ve won”</w:t>
+      </w:r>
+      <w:r>
+        <w:t>,</w:t>
+      </w:r>
+      <w:r>
+        <w:t xml:space="preserve"> “nigeria”</w:t>
+      </w:r>
+      <w:r>
+        <w:t>,</w:t>
+      </w:r>
+      <w:r>
+        <w:t xml:space="preserve"> and their corresponding translations in </w:t>
+      </w:r>
+      <w:r>
+        <w:t xml:space="preserve">the </w:t>
+      </w:r>
+      <w:r>
+        <w:t>supported languages</w:t>
+      </w:r>
+      <w:r>
+        <w:t xml:space="preserve">.  </w:t>
+      </w:r>
+      <w:r>
+        <w:t xml:space="preserve">The default threshold for identifying spam is </w:t>
+      </w:r>
+      <w:r>
+        <w:t xml:space="preserve">preset to </w:t>
+      </w:r>
+      <w:r>
+        <w:t>10%</w:t>
+      </w:r>
+      <w:r>
+        <w:t xml:space="preserve">.  </w:t>
+      </w:r>
+      <w:r>
+        <w:t>Administrators may modify both the spam terms and the threshold</w:t>
+      </w:r>
+      <w:r>
+        <w:t xml:space="preserve">.  </w:t>
+      </w:r>
+      <w:r>
+        <w:t xml:space="preserve">The system must preprocess text to account for </w:t>
+      </w:r>
+      <w:r>
+        <w:t>“</w:t>
+      </w:r>
+      <w:r>
+        <w:t>emphatic spacing</w:t>
+      </w:r>
+      <w:r>
+        <w:t>”</w:t>
+      </w:r>
+      <w:r>
+        <w:t xml:space="preserve"> by removing any punctuation between consecutive letters</w:t>
+      </w:r>
+      <w:r>
+        <w:t xml:space="preserve"> (e.g., "S.E.X", "H:A:R:D C:O:R:E", or "V*I:AG!$R-A")</w:t>
+      </w:r>
+      <w:r>
+        <w:t xml:space="preserve">. </w:t>
+      </w:r>
+      <w:r>
+        <w:t xml:space="preserve"> </w:t>
+      </w:r>
+      <w:r>
+        <w:t>A term is considered spam regardless of letter case or the placement of punctuation</w:t>
+      </w:r>
+      <w:r>
+        <w:t xml:space="preserve"> </w:t>
+      </w:r>
+      <w:r>
+        <w:t>symbols</w:t>
+      </w:r>
+      <w:r>
+        <w:t xml:space="preserve"> </w:t>
+      </w:r>
+      <w:r>
+        <w:t xml:space="preserve">in </w:t>
+      </w:r>
+      <w:r>
+        <w:t>between letters. For instance, “one</w:t>
+      </w:r>
+      <w:r>
+        <w:rPr>
+          <w:rFonts w:ascii="Segoe UI Symbol" w:hAnsi="Segoe UI Symbol" w:cs="Segoe UI Symbol"/>
+        </w:rPr>
+        <w:t>␣</w:t>
+      </w:r>
+      <w:r>
+        <w:t>million” would match “ONE</w:t>
+      </w:r>
+      <w:r>
+        <w:rPr>
+          <w:rFonts w:ascii="Segoe UI Symbol" w:hAnsi="Segoe UI Symbol" w:cs="Segoe UI Symbol"/>
+        </w:rPr>
+        <w:t>␣</w:t>
+      </w:r>
+      <w:r>
+        <w:t>MILLION”</w:t>
+      </w:r>
+      <w:r>
+        <w:t>,</w:t>
+      </w:r>
+      <w:r>
         <w:t xml:space="preserve"> “</w:t>
       </w:r>
-      <w:proofErr w:type="spellStart"/>
-      <w:r>
-        <w:t>viagra</w:t>
-      </w:r>
-      <w:proofErr w:type="spellEnd"/>
-      <w:r>
-        <w:t>”</w:t>
+      <w:r>
+        <w:t>*</w:t>
+      </w:r>
+      <w:r>
+        <w:t>O</w:t>
+      </w:r>
+      <w:r>
+        <w:t>*</w:t>
+      </w:r>
+      <w:r>
+        <w:t>n</w:t>
+      </w:r>
+      <w:r>
+        <w:t>*</w:t>
+      </w:r>
+      <w:r>
+        <w:t>E</w:t>
+      </w:r>
+      <w:r>
+        <w:rPr>
+          <w:rFonts w:ascii="Segoe UI Symbol" w:hAnsi="Segoe UI Symbol" w:cs="Segoe UI Symbol"/>
+        </w:rPr>
+        <w:t xml:space="preserve">* </w:t>
+      </w:r>
+      <w:r>
+        <w:t>M</w:t>
+      </w:r>
+      <w:r>
+        <w:t>:</w:t>
+      </w:r>
+      <w:r>
+        <w:t>i</w:t>
+      </w:r>
+      <w:r>
+        <w:t>:</w:t>
+      </w:r>
+      <w:r>
+        <w:t>L</w:t>
+      </w:r>
+      <w:r>
+        <w:t>:</w:t>
+      </w:r>
+      <w:r>
+        <w:t>L</w:t>
+      </w:r>
+      <w:r>
+        <w:t>:</w:t>
+      </w:r>
+      <w:r>
+        <w:t>i</w:t>
+      </w:r>
+      <w:r>
+        <w:t>:</w:t>
+      </w:r>
+      <w:r>
+        <w:t>O</w:t>
+      </w:r>
+      <w:r>
+        <w:t>:</w:t>
+      </w:r>
+      <w:r>
+        <w:t>n”</w:t>
       </w:r>
       <w:r>
         <w:t>,</w:t>
       </w:r>
       <w:r>
-        <w:t xml:space="preserve"> “</w:t>
-      </w:r>
-      <w:proofErr w:type="spellStart"/>
-      <w:r>
-        <w:t>cialis</w:t>
-      </w:r>
-      <w:proofErr w:type="spellEnd"/>
-      <w:r>
-        <w:t>”</w:t>
+        <w:t xml:space="preserve"> and “One</w:t>
+      </w:r>
+      <w:r>
+        <w:rPr>
+          <w:rFonts w:ascii="Segoe UI Symbol" w:hAnsi="Segoe UI Symbol" w:cs="Segoe UI Symbol"/>
+        </w:rPr>
+        <w:t>␣</w:t>
+      </w:r>
+      <w:r>
+        <w:rPr>
+          <w:rFonts w:ascii="Cambria Math" w:hAnsi="Cambria Math" w:cs="Cambria Math"/>
+        </w:rPr>
+        <w:t>⏎</w:t>
+      </w:r>
+      <w:r>
+        <w:rPr>
+          <w:rFonts w:ascii="Segoe UI Symbol" w:hAnsi="Segoe UI Symbol" w:cs="Segoe UI Symbol"/>
+        </w:rPr>
+        <w:t>␣</w:t>
+      </w:r>
+      <w:r>
+        <w:t>Million”</w:t>
       </w:r>
       <w:r>
         <w:t>,</w:t>
       </w:r>
       <w:r>
-        <w:t xml:space="preserve"> “one million”</w:t>
+        <w:t xml:space="preserve"> but would not match “One</w:t>
+      </w:r>
+      <w:r>
+        <w:rPr>
+          <w:rFonts w:ascii="Segoe UI Symbol" w:hAnsi="Segoe UI Symbol" w:cs="Segoe UI Symbol"/>
+        </w:rPr>
+        <w:t>␣</w:t>
+      </w:r>
+      <w:r>
+        <w:t>Millionaire”</w:t>
       </w:r>
       <w:r>
         <w:t>,</w:t>
       </w:r>
       <w:r>
-        <w:t xml:space="preserve"> “you’ve won”</w:t>
-      </w:r>
-      <w:r>
-        <w:t>,</w:t>
-      </w:r>
-      <w:r>
-        <w:t xml:space="preserve"> “</w:t>
-      </w:r>
-      <w:proofErr w:type="spellStart"/>
-      <w:r>
-        <w:t>nigeria</w:t>
-      </w:r>
-      <w:proofErr w:type="spellEnd"/>
-      <w:r>
-        <w:t>”</w:t>
-      </w:r>
-      <w:r>
-        <w:t>,</w:t>
-      </w:r>
-      <w:r>
-        <w:t xml:space="preserve"> and their corresponding translations in </w:t>
-      </w:r>
-      <w:r>
-        <w:t xml:space="preserve">the </w:t>
-      </w:r>
-      <w:r>
-        <w:t>supported languages</w:t>
-      </w:r>
-      <w:r>
-        <w:t xml:space="preserve">.  </w:t>
-      </w:r>
-      <w:r>
-        <w:t xml:space="preserve">The default threshold for identifying spam is </w:t>
-      </w:r>
-      <w:r>
-        <w:t xml:space="preserve">preset to </w:t>
-      </w:r>
-      <w:r>
-        <w:t>10%</w:t>
-      </w:r>
-      <w:r>
-        <w:t xml:space="preserve">.  </w:t>
-      </w:r>
-      <w:r>
-        <w:t>Administrators may modify both the spam terms and the threshold</w:t>
-      </w:r>
-      <w:r>
-        <w:t xml:space="preserve">.  </w:t>
-      </w:r>
-      <w:r>
-        <w:t xml:space="preserve">The system must preprocess text to account for </w:t>
-      </w:r>
-      <w:r>
-        <w:t>“</w:t>
-      </w:r>
-      <w:r>
-        <w:t>emphatic spacing</w:t>
-      </w:r>
-      <w:r>
-        <w:t>”</w:t>
-      </w:r>
-      <w:r>
-        <w:t xml:space="preserve"> by removing any punctuation between consecutive letters</w:t>
-      </w:r>
-      <w:r>
-        <w:t xml:space="preserve"> (e.g., "S.E.X", "</w:t>
-      </w:r>
-      <w:proofErr w:type="gramStart"/>
-      <w:r>
-        <w:t>H:A</w:t>
-      </w:r>
-      <w:proofErr w:type="gramEnd"/>
-      <w:r>
-        <w:t>:R:D C</w:t>
-      </w:r>
-      <w:proofErr w:type="gramStart"/>
-      <w:r>
-        <w:t>:O:R</w:t>
-      </w:r>
-      <w:proofErr w:type="gramEnd"/>
-      <w:r>
-        <w:t>:E", or "V*I:</w:t>
-      </w:r>
-      <w:proofErr w:type="gramStart"/>
-      <w:r>
-        <w:t>AG!$</w:t>
-      </w:r>
-      <w:proofErr w:type="gramEnd"/>
-      <w:r>
-        <w:t>R-A")</w:t>
-      </w:r>
-      <w:r>
-        <w:t xml:space="preserve">. </w:t>
-      </w:r>
-      <w:r>
-        <w:t xml:space="preserve"> </w:t>
-      </w:r>
-      <w:r>
-        <w:t>A term is considered spam regardless of letter case or the placement of punctuation</w:t>
-      </w:r>
-      <w:r>
-        <w:t xml:space="preserve"> </w:t>
-      </w:r>
-      <w:r>
-        <w:t>symbols</w:t>
-      </w:r>
-      <w:r>
-        <w:t xml:space="preserve"> </w:t>
-      </w:r>
-      <w:r>
-        <w:t xml:space="preserve">in </w:t>
-      </w:r>
-      <w:r>
-        <w:t>between letters. For instance, “</w:t>
-      </w:r>
-      <w:proofErr w:type="spellStart"/>
-      <w:r>
-        <w:t>one</w:t>
+        <w:t xml:space="preserve"> “One</w:t>
       </w:r>
       <w:r>
         <w:rPr>
@@ -7257,11 +7117,7 @@
         <w:t>␣</w:t>
       </w:r>
       <w:r>
-        <w:t>million</w:t>
-      </w:r>
-      <w:proofErr w:type="spellEnd"/>
-      <w:r>
-        <w:t>” would match “ONE</w:t>
+        <w:t>or</w:t>
       </w:r>
       <w:r>
         <w:rPr>
@@ -7270,91 +7126,22 @@
         <w:t>␣</w:t>
       </w:r>
       <w:r>
-        <w:t>MILLION”</w:t>
-      </w:r>
-      <w:r>
-        <w:t>,</w:t>
-      </w:r>
-      <w:r>
-        <w:t xml:space="preserve"> “</w:t>
-      </w:r>
-      <w:r>
-        <w:t>*</w:t>
-      </w:r>
-      <w:r>
-        <w:t>O</w:t>
-      </w:r>
-      <w:r>
-        <w:t>*</w:t>
-      </w:r>
-      <w:r>
-        <w:t>n</w:t>
-      </w:r>
-      <w:r>
-        <w:t>*</w:t>
-      </w:r>
-      <w:r>
-        <w:t>E</w:t>
+        <w:t>two</w:t>
       </w:r>
       <w:r>
         <w:rPr>
           <w:rFonts w:ascii="Segoe UI Symbol" w:hAnsi="Segoe UI Symbol" w:cs="Segoe UI Symbol"/>
         </w:rPr>
-        <w:t xml:space="preserve">* </w:t>
-      </w:r>
-      <w:proofErr w:type="gramStart"/>
-      <w:r>
-        <w:t>M</w:t>
-      </w:r>
-      <w:r>
-        <w:t>:</w:t>
-      </w:r>
-      <w:r>
-        <w:t>i</w:t>
-      </w:r>
-      <w:proofErr w:type="gramEnd"/>
-      <w:r>
-        <w:t>:</w:t>
-      </w:r>
-      <w:proofErr w:type="gramStart"/>
-      <w:r>
-        <w:t>L</w:t>
-      </w:r>
-      <w:r>
-        <w:t>:</w:t>
-      </w:r>
-      <w:r>
-        <w:t>L</w:t>
-      </w:r>
-      <w:proofErr w:type="gramEnd"/>
-      <w:r>
-        <w:t>:</w:t>
-      </w:r>
-      <w:r>
-        <w:t>i</w:t>
-      </w:r>
-      <w:proofErr w:type="gramStart"/>
-      <w:r>
-        <w:t>:</w:t>
-      </w:r>
-      <w:r>
-        <w:t>O</w:t>
-      </w:r>
-      <w:r>
-        <w:t>:</w:t>
-      </w:r>
-      <w:r>
-        <w:t>n</w:t>
-      </w:r>
-      <w:proofErr w:type="gramEnd"/>
-      <w:r>
-        <w:t>”</w:t>
-      </w:r>
-      <w:r>
-        <w:t>,</w:t>
-      </w:r>
-      <w:r>
-        <w:t xml:space="preserve"> and “One</w:t>
+        <w:t>␣</w:t>
+      </w:r>
+      <w:r>
+        <w:t>millions”</w:t>
+      </w:r>
+      <w:r>
+        <w:t xml:space="preserve">, </w:t>
+      </w:r>
+      <w:r>
+        <w:t>or “One</w:t>
       </w:r>
       <w:r>
         <w:rPr>
@@ -7363,10 +7150,7 @@
         <w:t>␣</w:t>
       </w:r>
       <w:r>
-        <w:rPr>
-          <w:rFonts w:ascii="Cambria Math" w:hAnsi="Cambria Math" w:cs="Cambria Math"/>
-        </w:rPr>
-        <w:t>⏎</w:t>
+        <w:t>sexy</w:t>
       </w:r>
       <w:r>
         <w:rPr>
@@ -7375,103 +7159,7 @@
         <w:t>␣</w:t>
       </w:r>
       <w:r>
-        <w:t>Million”</w:t>
-      </w:r>
-      <w:r>
-        <w:t>,</w:t>
-      </w:r>
-      <w:r>
-        <w:t xml:space="preserve"> but would not match “</w:t>
-      </w:r>
-      <w:proofErr w:type="spellStart"/>
-      <w:r>
-        <w:t>One</w:t>
-      </w:r>
-      <w:r>
-        <w:rPr>
-          <w:rFonts w:ascii="Segoe UI Symbol" w:hAnsi="Segoe UI Symbol" w:cs="Segoe UI Symbol"/>
-        </w:rPr>
-        <w:t>␣</w:t>
-      </w:r>
-      <w:r>
-        <w:t>Millionaire</w:t>
-      </w:r>
-      <w:proofErr w:type="spellEnd"/>
-      <w:r>
-        <w:t>”</w:t>
-      </w:r>
-      <w:r>
-        <w:t>,</w:t>
-      </w:r>
-      <w:r>
-        <w:t xml:space="preserve"> “</w:t>
-      </w:r>
-      <w:proofErr w:type="spellStart"/>
-      <w:r>
-        <w:t>One</w:t>
-      </w:r>
-      <w:r>
-        <w:rPr>
-          <w:rFonts w:ascii="Segoe UI Symbol" w:hAnsi="Segoe UI Symbol" w:cs="Segoe UI Symbol"/>
-        </w:rPr>
-        <w:t>␣</w:t>
-      </w:r>
-      <w:r>
-        <w:t>or</w:t>
-      </w:r>
-      <w:r>
-        <w:rPr>
-          <w:rFonts w:ascii="Segoe UI Symbol" w:hAnsi="Segoe UI Symbol" w:cs="Segoe UI Symbol"/>
-        </w:rPr>
-        <w:t>␣</w:t>
-      </w:r>
-      <w:r>
-        <w:t>two</w:t>
-      </w:r>
-      <w:r>
-        <w:rPr>
-          <w:rFonts w:ascii="Segoe UI Symbol" w:hAnsi="Segoe UI Symbol" w:cs="Segoe UI Symbol"/>
-        </w:rPr>
-        <w:t>␣</w:t>
-      </w:r>
-      <w:r>
-        <w:t>millions</w:t>
-      </w:r>
-      <w:proofErr w:type="spellEnd"/>
-      <w:r>
-        <w:t>”</w:t>
-      </w:r>
-      <w:r>
-        <w:t xml:space="preserve">, </w:t>
-      </w:r>
-      <w:r>
-        <w:t>or “</w:t>
-      </w:r>
-      <w:proofErr w:type="spellStart"/>
-      <w:r>
-        <w:t>One</w:t>
-      </w:r>
-      <w:r>
-        <w:rPr>
-          <w:rFonts w:ascii="Segoe UI Symbol" w:hAnsi="Segoe UI Symbol" w:cs="Segoe UI Symbol"/>
-        </w:rPr>
-        <w:t>␣</w:t>
-      </w:r>
-      <w:r>
-        <w:t>sexy</w:t>
-      </w:r>
-      <w:r>
-        <w:rPr>
-          <w:rFonts w:ascii="Segoe UI Symbol" w:hAnsi="Segoe UI Symbol" w:cs="Segoe UI Symbol"/>
-        </w:rPr>
-        <w:t>␣</w:t>
-      </w:r>
-      <w:r>
-        <w:t>million</w:t>
-      </w:r>
-      <w:proofErr w:type="spellEnd"/>
-      <w:r>
-        <w:t>”</w:t>
+        <w:t>million”</w:t>
       </w:r>
       <w:r>
         <w:t>.</w:t>
@@ -7562,7 +7250,7 @@
     </w:p>
     <w:p>
       <w:pPr>
-        <w:pStyle w:val="Ttulo2"/>
+        <w:pStyle w:val="Heading2"/>
         <w:rPr>
           <w:rFonts w:cstheme="majorHAnsi"/>
         </w:rPr>
@@ -7588,7 +7276,7 @@
     </w:p>
     <w:p>
       <w:pPr>
-        <w:pStyle w:val="Ttulo2"/>
+        <w:pStyle w:val="Heading2"/>
         <w:rPr>
           <w:rFonts w:cstheme="majorHAnsi"/>
         </w:rPr>
@@ -7673,7 +7361,7 @@
     </w:p>
     <w:p>
       <w:pPr>
-        <w:pStyle w:val="Ttulo1"/>
+        <w:pStyle w:val="Heading1"/>
         <w:tabs>
           <w:tab w:val="left" w:pos="284"/>
         </w:tabs>
@@ -7709,7 +7397,7 @@
     </w:p>
     <w:p>
       <w:pPr>
-        <w:pStyle w:val="Ttulo2"/>
+        <w:pStyle w:val="Heading2"/>
         <w:rPr>
           <w:rFonts w:cstheme="majorHAnsi"/>
         </w:rPr>
@@ -7734,7 +7422,7 @@
     </w:p>
     <w:p>
       <w:pPr>
-        <w:pStyle w:val="Ttulo2"/>
+        <w:pStyle w:val="Heading2"/>
         <w:rPr>
           <w:rFonts w:cstheme="majorHAnsi"/>
         </w:rPr>
@@ -7759,7 +7447,7 @@
     </w:p>
     <w:p>
       <w:pPr>
-        <w:pStyle w:val="Ttulo2"/>
+        <w:pStyle w:val="Heading2"/>
         <w:rPr>
           <w:rFonts w:cstheme="majorHAnsi"/>
         </w:rPr>
@@ -7784,7 +7472,7 @@
     </w:p>
     <w:p>
       <w:pPr>
-        <w:pStyle w:val="Ttulo2"/>
+        <w:pStyle w:val="Heading2"/>
         <w:rPr>
           <w:rFonts w:cstheme="majorHAnsi"/>
         </w:rPr>
@@ -7844,7 +7532,7 @@
     </w:p>
     <w:p>
       <w:pPr>
-        <w:pStyle w:val="Ttulo2"/>
+        <w:pStyle w:val="Heading2"/>
         <w:rPr>
           <w:rFonts w:cstheme="majorHAnsi"/>
         </w:rPr>
@@ -8009,7 +7697,7 @@
     <w:lvl w:ilvl="0">
       <w:start w:val="1"/>
       <w:numFmt w:val="decimal"/>
-      <w:pStyle w:val="Listaconnmeros"/>
+      <w:pStyle w:val="ListNumber"/>
       <w:lvlText w:val="%1."/>
       <w:lvlJc w:val="left"/>
       <w:pPr>
@@ -8233,7 +7921,7 @@
     <w:lvl w:ilvl="0" w:tplc="391EA46E">
       <w:start w:val="1"/>
       <w:numFmt w:val="decimal"/>
-      <w:pStyle w:val="Prrafodelista"/>
+      <w:pStyle w:val="ListParagraph"/>
       <w:lvlText w:val="%1)"/>
       <w:lvlJc w:val="left"/>
       <w:pPr>
@@ -9253,11 +8941,11 @@
       <w:lang w:val="en-GB"/>
     </w:rPr>
   </w:style>
-  <w:style w:type="paragraph" w:styleId="Ttulo1">
+  <w:style w:type="paragraph" w:styleId="Heading1">
     <w:name w:val="heading 1"/>
     <w:basedOn w:val="Normal"/>
     <w:next w:val="Normal"/>
-    <w:link w:val="Ttulo1Car"/>
+    <w:link w:val="Heading1Char"/>
     <w:uiPriority w:val="9"/>
     <w:qFormat/>
     <w:rsid w:val="005559E5"/>
@@ -9285,11 +8973,11 @@
       <w14:ligatures w14:val="none"/>
     </w:rPr>
   </w:style>
-  <w:style w:type="paragraph" w:styleId="Ttulo2">
+  <w:style w:type="paragraph" w:styleId="Heading2">
     <w:name w:val="heading 2"/>
     <w:basedOn w:val="Normal"/>
     <w:next w:val="Normal"/>
-    <w:link w:val="Ttulo2Car"/>
+    <w:link w:val="Heading2Char"/>
     <w:uiPriority w:val="9"/>
     <w:unhideWhenUsed/>
     <w:qFormat/>
@@ -9313,11 +9001,11 @@
       <w14:ligatures w14:val="none"/>
     </w:rPr>
   </w:style>
-  <w:style w:type="paragraph" w:styleId="Ttulo3">
+  <w:style w:type="paragraph" w:styleId="Heading3">
     <w:name w:val="heading 3"/>
     <w:basedOn w:val="Normal"/>
     <w:next w:val="Normal"/>
-    <w:link w:val="Ttulo3Car"/>
+    <w:link w:val="Heading3Char"/>
     <w:uiPriority w:val="9"/>
     <w:unhideWhenUsed/>
     <w:rsid w:val="00F772E9"/>
@@ -9332,13 +9020,13 @@
       <w:color w:val="1F3763" w:themeColor="accent1" w:themeShade="7F"/>
     </w:rPr>
   </w:style>
-  <w:style w:type="character" w:default="1" w:styleId="Fuentedeprrafopredeter">
+  <w:style w:type="character" w:default="1" w:styleId="DefaultParagraphFont">
     <w:name w:val="Default Paragraph Font"/>
     <w:uiPriority w:val="1"/>
     <w:semiHidden/>
     <w:unhideWhenUsed/>
   </w:style>
-  <w:style w:type="table" w:default="1" w:styleId="Tablanormal">
+  <w:style w:type="table" w:default="1" w:styleId="TableNormal">
     <w:name w:val="Normal Table"/>
     <w:uiPriority w:val="99"/>
     <w:semiHidden/>
@@ -9353,16 +9041,16 @@
       </w:tblCellMar>
     </w:tblPr>
   </w:style>
-  <w:style w:type="numbering" w:default="1" w:styleId="Sinlista">
+  <w:style w:type="numbering" w:default="1" w:styleId="NoList">
     <w:name w:val="No List"/>
     <w:uiPriority w:val="99"/>
     <w:semiHidden/>
     <w:unhideWhenUsed/>
   </w:style>
-  <w:style w:type="character" w:customStyle="1" w:styleId="Ttulo1Car">
-    <w:name w:val="Título 1 Car"/>
-    <w:basedOn w:val="Fuentedeprrafopredeter"/>
-    <w:link w:val="Ttulo1"/>
+  <w:style w:type="character" w:customStyle="1" w:styleId="Heading1Char">
+    <w:name w:val="Heading 1 Char"/>
+    <w:basedOn w:val="DefaultParagraphFont"/>
+    <w:link w:val="Heading1"/>
     <w:uiPriority w:val="9"/>
     <w:rsid w:val="005559E5"/>
     <w:rPr>
@@ -9376,10 +9064,10 @@
       <w14:ligatures w14:val="none"/>
     </w:rPr>
   </w:style>
-  <w:style w:type="character" w:customStyle="1" w:styleId="Ttulo2Car">
-    <w:name w:val="Título 2 Car"/>
-    <w:basedOn w:val="Fuentedeprrafopredeter"/>
-    <w:link w:val="Ttulo2"/>
+  <w:style w:type="character" w:customStyle="1" w:styleId="Heading2Char">
+    <w:name w:val="Heading 2 Char"/>
+    <w:basedOn w:val="DefaultParagraphFont"/>
+    <w:link w:val="Heading2"/>
     <w:uiPriority w:val="9"/>
     <w:rsid w:val="00F772E9"/>
     <w:rPr>
@@ -9418,9 +9106,9 @@
       <w14:ligatures w14:val="none"/>
     </w:rPr>
   </w:style>
-  <w:style w:type="paragraph" w:styleId="Prrafodelista">
+  <w:style w:type="paragraph" w:styleId="ListParagraph">
     <w:name w:val="List Paragraph"/>
-    <w:basedOn w:val="Listaconnmeros"/>
+    <w:basedOn w:val="ListNumber"/>
     <w:uiPriority w:val="34"/>
     <w:qFormat/>
     <w:rsid w:val="00F772E9"/>
@@ -9440,7 +9128,7 @@
   </w:style>
   <w:style w:type="paragraph" w:customStyle="1" w:styleId="Prrafodesublista">
     <w:name w:val="Párrafo de sublista"/>
-    <w:basedOn w:val="Prrafodelista"/>
+    <w:basedOn w:val="ListParagraph"/>
     <w:qFormat/>
     <w:rsid w:val="00A64124"/>
     <w:pPr>
@@ -9457,7 +9145,7 @@
       <w:rFonts w:eastAsia="Courier New" w:cs="Courier New"/>
     </w:rPr>
   </w:style>
-  <w:style w:type="paragraph" w:styleId="Sinespaciado">
+  <w:style w:type="paragraph" w:styleId="NoSpacing">
     <w:name w:val="No Spacing"/>
     <w:uiPriority w:val="1"/>
     <w:rsid w:val="00F772E9"/>
@@ -9471,9 +9159,9 @@
       <w14:ligatures w14:val="none"/>
     </w:rPr>
   </w:style>
-  <w:style w:type="character" w:styleId="Textoennegrita">
+  <w:style w:type="character" w:styleId="Strong">
     <w:name w:val="Strong"/>
-    <w:basedOn w:val="Fuentedeprrafopredeter"/>
+    <w:basedOn w:val="DefaultParagraphFont"/>
     <w:uiPriority w:val="22"/>
     <w:qFormat/>
     <w:rsid w:val="00F772E9"/>
@@ -9482,9 +9170,9 @@
       <w:bCs/>
     </w:rPr>
   </w:style>
-  <w:style w:type="character" w:styleId="Refdecomentario">
+  <w:style w:type="character" w:styleId="CommentReference">
     <w:name w:val="annotation reference"/>
-    <w:basedOn w:val="Fuentedeprrafopredeter"/>
+    <w:basedOn w:val="DefaultParagraphFont"/>
     <w:uiPriority w:val="99"/>
     <w:semiHidden/>
     <w:unhideWhenUsed/>
@@ -9494,10 +9182,10 @@
       <w:szCs w:val="16"/>
     </w:rPr>
   </w:style>
-  <w:style w:type="paragraph" w:styleId="Textocomentario">
+  <w:style w:type="paragraph" w:styleId="CommentText">
     <w:name w:val="annotation text"/>
     <w:basedOn w:val="Normal"/>
-    <w:link w:val="TextocomentarioCar"/>
+    <w:link w:val="CommentTextChar"/>
     <w:uiPriority w:val="99"/>
     <w:unhideWhenUsed/>
     <w:rsid w:val="00F772E9"/>
@@ -9506,10 +9194,10 @@
       <w:szCs w:val="20"/>
     </w:rPr>
   </w:style>
-  <w:style w:type="character" w:customStyle="1" w:styleId="TextocomentarioCar">
-    <w:name w:val="Texto comentario Car"/>
-    <w:basedOn w:val="Fuentedeprrafopredeter"/>
-    <w:link w:val="Textocomentario"/>
+  <w:style w:type="character" w:customStyle="1" w:styleId="CommentTextChar">
+    <w:name w:val="Comment Text Char"/>
+    <w:basedOn w:val="DefaultParagraphFont"/>
+    <w:link w:val="CommentText"/>
     <w:uiPriority w:val="99"/>
     <w:rsid w:val="00F772E9"/>
     <w:rPr>
@@ -9518,11 +9206,11 @@
       <w:lang w:val="en-GB"/>
     </w:rPr>
   </w:style>
-  <w:style w:type="paragraph" w:styleId="Asuntodelcomentario">
+  <w:style w:type="paragraph" w:styleId="CommentSubject">
     <w:name w:val="annotation subject"/>
     <w:basedOn w:val="Normal"/>
     <w:next w:val="Normal"/>
-    <w:link w:val="AsuntodelcomentarioCar"/>
+    <w:link w:val="CommentSubjectChar"/>
     <w:uiPriority w:val="99"/>
     <w:semiHidden/>
     <w:unhideWhenUsed/>
@@ -9534,10 +9222,10 @@
       <w:szCs w:val="20"/>
     </w:rPr>
   </w:style>
-  <w:style w:type="character" w:customStyle="1" w:styleId="AsuntodelcomentarioCar">
-    <w:name w:val="Asunto del comentario Car"/>
-    <w:basedOn w:val="Fuentedeprrafopredeter"/>
-    <w:link w:val="Asuntodelcomentario"/>
+  <w:style w:type="character" w:customStyle="1" w:styleId="CommentSubjectChar">
+    <w:name w:val="Comment Subject Char"/>
+    <w:basedOn w:val="DefaultParagraphFont"/>
+    <w:link w:val="CommentSubject"/>
     <w:uiPriority w:val="99"/>
     <w:semiHidden/>
     <w:rsid w:val="00F772E9"/>
@@ -9549,9 +9237,9 @@
       <w:lang w:val="en-GB"/>
     </w:rPr>
   </w:style>
-  <w:style w:type="character" w:styleId="Textodelmarcadordeposicin">
+  <w:style w:type="character" w:styleId="PlaceholderText">
     <w:name w:val="Placeholder Text"/>
-    <w:basedOn w:val="Fuentedeprrafopredeter"/>
+    <w:basedOn w:val="DefaultParagraphFont"/>
     <w:uiPriority w:val="99"/>
     <w:semiHidden/>
     <w:rsid w:val="00F772E9"/>
@@ -9559,9 +9247,9 @@
       <w:color w:val="808080"/>
     </w:rPr>
   </w:style>
-  <w:style w:type="character" w:styleId="Hipervnculo">
+  <w:style w:type="character" w:styleId="Hyperlink">
     <w:name w:val="Hyperlink"/>
-    <w:basedOn w:val="Fuentedeprrafopredeter"/>
+    <w:basedOn w:val="DefaultParagraphFont"/>
     <w:uiPriority w:val="99"/>
     <w:unhideWhenUsed/>
     <w:rsid w:val="00F772E9"/>
@@ -9580,10 +9268,10 @@
       <w:spacing w:before="240" w:after="240"/>
     </w:pPr>
   </w:style>
-  <w:style w:type="character" w:customStyle="1" w:styleId="Ttulo3Car">
-    <w:name w:val="Título 3 Car"/>
-    <w:basedOn w:val="Fuentedeprrafopredeter"/>
-    <w:link w:val="Ttulo3"/>
+  <w:style w:type="character" w:customStyle="1" w:styleId="Heading3Char">
+    <w:name w:val="Heading 3 Char"/>
+    <w:basedOn w:val="DefaultParagraphFont"/>
+    <w:link w:val="Heading3"/>
     <w:uiPriority w:val="9"/>
     <w:rsid w:val="00F772E9"/>
     <w:rPr>
@@ -9594,7 +9282,7 @@
       <w:lang w:val="en-GB"/>
     </w:rPr>
   </w:style>
-  <w:style w:type="paragraph" w:styleId="Lista">
+  <w:style w:type="paragraph" w:styleId="List">
     <w:name w:val="List"/>
     <w:basedOn w:val="Normal"/>
     <w:uiPriority w:val="99"/>
@@ -9606,7 +9294,7 @@
       <w:contextualSpacing/>
     </w:pPr>
   </w:style>
-  <w:style w:type="paragraph" w:styleId="Listaconnmeros">
+  <w:style w:type="paragraph" w:styleId="ListNumber">
     <w:name w:val="List Number"/>
     <w:basedOn w:val="Normal"/>
     <w:uiPriority w:val="99"/>
@@ -9622,7 +9310,7 @@
   </w:style>
   <w:style w:type="paragraph" w:customStyle="1" w:styleId="Requirement-Body">
     <w:name w:val="Requirement - Body"/>
-    <w:basedOn w:val="Lista"/>
+    <w:basedOn w:val="List"/>
     <w:qFormat/>
     <w:rsid w:val="0089026D"/>
     <w:pPr>
@@ -9634,7 +9322,7 @@
   </w:style>
   <w:style w:type="paragraph" w:customStyle="1" w:styleId="Requirement-Header">
     <w:name w:val="Requirement - Header"/>
-    <w:basedOn w:val="Lista"/>
+    <w:basedOn w:val="List"/>
     <w:next w:val="Requirement-Body"/>
     <w:qFormat/>
     <w:rsid w:val="002D4E43"/>
@@ -9645,11 +9333,11 @@
       <w:ind w:left="567" w:hanging="567"/>
     </w:pPr>
   </w:style>
-  <w:style w:type="paragraph" w:styleId="Ttulo">
+  <w:style w:type="paragraph" w:styleId="Title">
     <w:name w:val="Title"/>
     <w:basedOn w:val="Normal"/>
     <w:next w:val="Normal"/>
-    <w:link w:val="TtuloCar"/>
+    <w:link w:val="TitleChar"/>
     <w:uiPriority w:val="10"/>
     <w:qFormat/>
     <w:rsid w:val="00F772E9"/>
@@ -9670,10 +9358,10 @@
       <w:szCs w:val="56"/>
     </w:rPr>
   </w:style>
-  <w:style w:type="character" w:customStyle="1" w:styleId="TtuloCar">
-    <w:name w:val="Título Car"/>
-    <w:basedOn w:val="Fuentedeprrafopredeter"/>
-    <w:link w:val="Ttulo"/>
+  <w:style w:type="character" w:customStyle="1" w:styleId="TitleChar">
+    <w:name w:val="Title Char"/>
+    <w:basedOn w:val="DefaultParagraphFont"/>
+    <w:link w:val="Title"/>
     <w:uiPriority w:val="10"/>
     <w:rsid w:val="00F772E9"/>
     <w:rPr>
@@ -9685,9 +9373,9 @@
       <w:lang w:val="en-GB"/>
     </w:rPr>
   </w:style>
-  <w:style w:type="character" w:styleId="Mencionar">
+  <w:style w:type="character" w:styleId="Mention">
     <w:name w:val="Mention"/>
-    <w:basedOn w:val="Fuentedeprrafopredeter"/>
+    <w:basedOn w:val="DefaultParagraphFont"/>
     <w:uiPriority w:val="99"/>
     <w:unhideWhenUsed/>
     <w:rsid w:val="00F772E9"/>
@@ -9696,9 +9384,9 @@
       <w:shd w:val="clear" w:color="auto" w:fill="E1DFDD"/>
     </w:rPr>
   </w:style>
-  <w:style w:type="character" w:styleId="Mencinsinresolver">
+  <w:style w:type="character" w:styleId="UnresolvedMention">
     <w:name w:val="Unresolved Mention"/>
-    <w:basedOn w:val="Fuentedeprrafopredeter"/>
+    <w:basedOn w:val="DefaultParagraphFont"/>
     <w:uiPriority w:val="99"/>
     <w:semiHidden/>
     <w:unhideWhenUsed/>
@@ -9708,10 +9396,10 @@
       <w:shd w:val="clear" w:color="auto" w:fill="E1DFDD"/>
     </w:rPr>
   </w:style>
-  <w:style w:type="paragraph" w:styleId="Encabezado">
+  <w:style w:type="paragraph" w:styleId="Header">
     <w:name w:val="header"/>
     <w:basedOn w:val="Normal"/>
-    <w:link w:val="EncabezadoCar"/>
+    <w:link w:val="HeaderChar"/>
     <w:uiPriority w:val="99"/>
     <w:unhideWhenUsed/>
     <w:rsid w:val="0029300C"/>
@@ -9723,10 +9411,10 @@
       <w:spacing w:before="0" w:after="0"/>
     </w:pPr>
   </w:style>
-  <w:style w:type="character" w:customStyle="1" w:styleId="EncabezadoCar">
-    <w:name w:val="Encabezado Car"/>
-    <w:basedOn w:val="Fuentedeprrafopredeter"/>
-    <w:link w:val="Encabezado"/>
+  <w:style w:type="character" w:customStyle="1" w:styleId="HeaderChar">
+    <w:name w:val="Header Char"/>
+    <w:basedOn w:val="DefaultParagraphFont"/>
+    <w:link w:val="Header"/>
     <w:uiPriority w:val="99"/>
     <w:rsid w:val="0029300C"/>
     <w:rPr>
@@ -9735,10 +9423,10 @@
       <w:lang w:val="en-GB"/>
     </w:rPr>
   </w:style>
-  <w:style w:type="paragraph" w:styleId="Piedepgina">
+  <w:style w:type="paragraph" w:styleId="Footer">
     <w:name w:val="footer"/>
     <w:basedOn w:val="Normal"/>
-    <w:link w:val="PiedepginaCar"/>
+    <w:link w:val="FooterChar"/>
     <w:uiPriority w:val="99"/>
     <w:unhideWhenUsed/>
     <w:rsid w:val="0029300C"/>
@@ -9750,10 +9438,10 @@
       <w:spacing w:before="0" w:after="0"/>
     </w:pPr>
   </w:style>
-  <w:style w:type="character" w:customStyle="1" w:styleId="PiedepginaCar">
-    <w:name w:val="Pie de página Car"/>
-    <w:basedOn w:val="Fuentedeprrafopredeter"/>
-    <w:link w:val="Piedepgina"/>
+  <w:style w:type="character" w:customStyle="1" w:styleId="FooterChar">
+    <w:name w:val="Footer Char"/>
+    <w:basedOn w:val="DefaultParagraphFont"/>
+    <w:link w:val="Footer"/>
     <w:uiPriority w:val="99"/>
     <w:rsid w:val="0029300C"/>
     <w:rPr>
@@ -9762,9 +9450,9 @@
       <w:lang w:val="en-GB"/>
     </w:rPr>
   </w:style>
-  <w:style w:type="character" w:styleId="Hipervnculovisitado">
+  <w:style w:type="character" w:styleId="FollowedHyperlink">
     <w:name w:val="FollowedHyperlink"/>
-    <w:basedOn w:val="Fuentedeprrafopredeter"/>
+    <w:basedOn w:val="DefaultParagraphFont"/>
     <w:uiPriority w:val="99"/>
     <w:semiHidden/>
     <w:unhideWhenUsed/>
@@ -9802,7 +9490,7 @@
           </w:pPr>
           <w:r>
             <w:rPr>
-              <w:rStyle w:val="Textodelmarcadordeposicin"/>
+              <w:rStyle w:val="PlaceholderText"/>
             </w:rPr>
             <w:t>Haga clic o pulse aquí para escribir texto.</w:t>
           </w:r>
@@ -9831,7 +9519,7 @@
           </w:pPr>
           <w:r>
             <w:rPr>
-              <w:rStyle w:val="Textodelmarcadordeposicin"/>
+              <w:rStyle w:val="PlaceholderText"/>
             </w:rPr>
             <w:t>Haga clic o pulse aquí para escribir texto.</w:t>
           </w:r>
@@ -9860,7 +9548,7 @@
           </w:pPr>
           <w:r>
             <w:rPr>
-              <w:rStyle w:val="Textodelmarcadordeposicin"/>
+              <w:rStyle w:val="PlaceholderText"/>
             </w:rPr>
             <w:t>Haga clic o pulse aquí para escribir texto.</w:t>
           </w:r>
@@ -9889,7 +9577,7 @@
           </w:pPr>
           <w:r>
             <w:rPr>
-              <w:rStyle w:val="Textodelmarcadordeposicin"/>
+              <w:rStyle w:val="PlaceholderText"/>
             </w:rPr>
             <w:t>Haga clic o pulse aquí para escribir texto.</w:t>
           </w:r>
@@ -9918,7 +9606,7 @@
           </w:pPr>
           <w:r>
             <w:rPr>
-              <w:rStyle w:val="Textodelmarcadordeposicin"/>
+              <w:rStyle w:val="PlaceholderText"/>
             </w:rPr>
             <w:t>Haga clic o pulse aquí para escribir texto.</w:t>
           </w:r>
@@ -9947,7 +9635,7 @@
           </w:pPr>
           <w:r>
             <w:rPr>
-              <w:rStyle w:val="Textodelmarcadordeposicin"/>
+              <w:rStyle w:val="PlaceholderText"/>
             </w:rPr>
             <w:t>Haga clic o pulse aquí para escribir texto.</w:t>
           </w:r>
@@ -9976,7 +9664,7 @@
           </w:pPr>
           <w:r>
             <w:rPr>
-              <w:rStyle w:val="Textodelmarcadordeposicin"/>
+              <w:rStyle w:val="PlaceholderText"/>
             </w:rPr>
             <w:t>Haga clic o pulse aquí para escribir texto.</w:t>
           </w:r>
@@ -10005,7 +9693,7 @@
           </w:pPr>
           <w:r>
             <w:rPr>
-              <w:rStyle w:val="Textodelmarcadordeposicin"/>
+              <w:rStyle w:val="PlaceholderText"/>
             </w:rPr>
             <w:t>Haga clic o pulse aquí para escribir texto.</w:t>
           </w:r>
@@ -10034,7 +9722,7 @@
           </w:pPr>
           <w:r>
             <w:rPr>
-              <w:rStyle w:val="Textodelmarcadordeposicin"/>
+              <w:rStyle w:val="PlaceholderText"/>
             </w:rPr>
             <w:t>Haga clic o pulse aquí para escribir texto.</w:t>
           </w:r>
@@ -10063,7 +9751,7 @@
           </w:pPr>
           <w:r>
             <w:rPr>
-              <w:rStyle w:val="Textodelmarcadordeposicin"/>
+              <w:rStyle w:val="PlaceholderText"/>
             </w:rPr>
             <w:t>Haga clic o pulse aquí para escribir texto.</w:t>
           </w:r>
@@ -10092,7 +9780,7 @@
           </w:pPr>
           <w:r>
             <w:rPr>
-              <w:rStyle w:val="Textodelmarcadordeposicin"/>
+              <w:rStyle w:val="PlaceholderText"/>
             </w:rPr>
             <w:t>Haga clic o pulse aquí para escribir texto.</w:t>
           </w:r>
@@ -10121,7 +9809,7 @@
           </w:pPr>
           <w:r>
             <w:rPr>
-              <w:rStyle w:val="Textodelmarcadordeposicin"/>
+              <w:rStyle w:val="PlaceholderText"/>
             </w:rPr>
             <w:t>Haga clic o pulse aquí para escribir texto.</w:t>
           </w:r>
@@ -10150,7 +9838,7 @@
           </w:pPr>
           <w:r>
             <w:rPr>
-              <w:rStyle w:val="Textodelmarcadordeposicin"/>
+              <w:rStyle w:val="PlaceholderText"/>
             </w:rPr>
             <w:t>Haga clic o pulse aquí para escribir texto.</w:t>
           </w:r>
@@ -10179,7 +9867,7 @@
           </w:pPr>
           <w:r>
             <w:rPr>
-              <w:rStyle w:val="Textodelmarcadordeposicin"/>
+              <w:rStyle w:val="PlaceholderText"/>
             </w:rPr>
             <w:t>Haga clic o pulse aquí para escribir texto.</w:t>
           </w:r>
@@ -10208,7 +9896,7 @@
           </w:pPr>
           <w:r>
             <w:rPr>
-              <w:rStyle w:val="Textodelmarcadordeposicin"/>
+              <w:rStyle w:val="PlaceholderText"/>
             </w:rPr>
             <w:t>Haga clic o pulse aquí para escribir texto.</w:t>
           </w:r>
@@ -10237,7 +9925,7 @@
           </w:pPr>
           <w:r>
             <w:rPr>
-              <w:rStyle w:val="Textodelmarcadordeposicin"/>
+              <w:rStyle w:val="PlaceholderText"/>
             </w:rPr>
             <w:t>Haga clic o pulse aquí para escribir texto.</w:t>
           </w:r>
@@ -10266,7 +9954,7 @@
           </w:pPr>
           <w:r>
             <w:rPr>
-              <w:rStyle w:val="Textodelmarcadordeposicin"/>
+              <w:rStyle w:val="PlaceholderText"/>
             </w:rPr>
             <w:t>Haga clic o pulse aquí para escribir texto.</w:t>
           </w:r>
@@ -10295,7 +9983,7 @@
           </w:pPr>
           <w:r>
             <w:rPr>
-              <w:rStyle w:val="Textodelmarcadordeposicin"/>
+              <w:rStyle w:val="PlaceholderText"/>
             </w:rPr>
             <w:t>Haga clic o pulse aquí para escribir texto.</w:t>
           </w:r>
@@ -10324,7 +10012,7 @@
           </w:pPr>
           <w:r>
             <w:rPr>
-              <w:rStyle w:val="Textodelmarcadordeposicin"/>
+              <w:rStyle w:val="PlaceholderText"/>
             </w:rPr>
             <w:t>Haga clic o pulse aquí para escribir texto.</w:t>
           </w:r>
@@ -10353,7 +10041,7 @@
           </w:pPr>
           <w:r>
             <w:rPr>
-              <w:rStyle w:val="Textodelmarcadordeposicin"/>
+              <w:rStyle w:val="PlaceholderText"/>
             </w:rPr>
             <w:t>Haga clic o pulse aquí para escribir texto.</w:t>
           </w:r>
@@ -10382,7 +10070,7 @@
           </w:pPr>
           <w:r>
             <w:rPr>
-              <w:rStyle w:val="Textodelmarcadordeposicin"/>
+              <w:rStyle w:val="PlaceholderText"/>
             </w:rPr>
             <w:t>Haga clic o pulse aquí para escribir texto.</w:t>
           </w:r>
@@ -10411,7 +10099,7 @@
           </w:pPr>
           <w:r>
             <w:rPr>
-              <w:rStyle w:val="Textodelmarcadordeposicin"/>
+              <w:rStyle w:val="PlaceholderText"/>
             </w:rPr>
             <w:t>Haga clic o pulse aquí para escribir texto.</w:t>
           </w:r>
@@ -10440,7 +10128,7 @@
           </w:pPr>
           <w:r>
             <w:rPr>
-              <w:rStyle w:val="Textodelmarcadordeposicin"/>
+              <w:rStyle w:val="PlaceholderText"/>
             </w:rPr>
             <w:t>Haga clic o pulse aquí para escribir texto.</w:t>
           </w:r>
@@ -10469,7 +10157,7 @@
           </w:pPr>
           <w:r>
             <w:rPr>
-              <w:rStyle w:val="Textodelmarcadordeposicin"/>
+              <w:rStyle w:val="PlaceholderText"/>
             </w:rPr>
             <w:t>Haga clic o pulse aquí para escribir texto.</w:t>
           </w:r>
@@ -10498,7 +10186,7 @@
           </w:pPr>
           <w:r>
             <w:rPr>
-              <w:rStyle w:val="Textodelmarcadordeposicin"/>
+              <w:rStyle w:val="PlaceholderText"/>
             </w:rPr>
             <w:t>Haga clic o pulse aquí para escribir texto.</w:t>
           </w:r>
@@ -10527,7 +10215,7 @@
           </w:pPr>
           <w:r>
             <w:rPr>
-              <w:rStyle w:val="Textodelmarcadordeposicin"/>
+              <w:rStyle w:val="PlaceholderText"/>
             </w:rPr>
             <w:t>Haga clic o pulse aquí para escribir texto.</w:t>
           </w:r>
@@ -10556,7 +10244,7 @@
           </w:pPr>
           <w:r>
             <w:rPr>
-              <w:rStyle w:val="Textodelmarcadordeposicin"/>
+              <w:rStyle w:val="PlaceholderText"/>
             </w:rPr>
             <w:t>Haga clic o pulse aquí para escribir texto.</w:t>
           </w:r>
@@ -10585,7 +10273,7 @@
           </w:pPr>
           <w:r>
             <w:rPr>
-              <w:rStyle w:val="Textodelmarcadordeposicin"/>
+              <w:rStyle w:val="PlaceholderText"/>
             </w:rPr>
             <w:t>Haga clic o pulse aquí para escribir texto.</w:t>
           </w:r>
@@ -10614,7 +10302,7 @@
           </w:pPr>
           <w:r>
             <w:rPr>
-              <w:rStyle w:val="Textodelmarcadordeposicin"/>
+              <w:rStyle w:val="PlaceholderText"/>
             </w:rPr>
             <w:t>Haga clic o pulse aquí para escribir texto.</w:t>
           </w:r>
@@ -10643,7 +10331,7 @@
           </w:pPr>
           <w:r>
             <w:rPr>
-              <w:rStyle w:val="Textodelmarcadordeposicin"/>
+              <w:rStyle w:val="PlaceholderText"/>
             </w:rPr>
             <w:t>Haga clic o pulse aquí para escribir texto.</w:t>
           </w:r>
@@ -10672,7 +10360,7 @@
           </w:pPr>
           <w:r>
             <w:rPr>
-              <w:rStyle w:val="Textodelmarcadordeposicin"/>
+              <w:rStyle w:val="PlaceholderText"/>
             </w:rPr>
             <w:t>Haga clic o pulse aquí para escribir texto.</w:t>
           </w:r>
@@ -10701,7 +10389,7 @@
           </w:pPr>
           <w:r>
             <w:rPr>
-              <w:rStyle w:val="Textodelmarcadordeposicin"/>
+              <w:rStyle w:val="PlaceholderText"/>
             </w:rPr>
             <w:t>Haga clic o pulse aquí para escribir texto.</w:t>
           </w:r>
@@ -10730,7 +10418,7 @@
           </w:pPr>
           <w:r>
             <w:rPr>
-              <w:rStyle w:val="Textodelmarcadordeposicin"/>
+              <w:rStyle w:val="PlaceholderText"/>
             </w:rPr>
             <w:t>Haga clic o pulse aquí para escribir texto.</w:t>
           </w:r>
@@ -10759,7 +10447,7 @@
           </w:pPr>
           <w:r>
             <w:rPr>
-              <w:rStyle w:val="Textodelmarcadordeposicin"/>
+              <w:rStyle w:val="PlaceholderText"/>
             </w:rPr>
             <w:t>Haga clic o pulse aquí para escribir texto.</w:t>
           </w:r>
@@ -10788,7 +10476,7 @@
           </w:pPr>
           <w:r>
             <w:rPr>
-              <w:rStyle w:val="Textodelmarcadordeposicin"/>
+              <w:rStyle w:val="PlaceholderText"/>
             </w:rPr>
             <w:t>Haga clic o pulse aquí para escribir texto.</w:t>
           </w:r>
@@ -10817,7 +10505,7 @@
           </w:pPr>
           <w:r>
             <w:rPr>
-              <w:rStyle w:val="Textodelmarcadordeposicin"/>
+              <w:rStyle w:val="PlaceholderText"/>
             </w:rPr>
             <w:t>Haga clic o pulse aquí para escribir texto.</w:t>
           </w:r>
@@ -10846,7 +10534,7 @@
           </w:pPr>
           <w:r>
             <w:rPr>
-              <w:rStyle w:val="Textodelmarcadordeposicin"/>
+              <w:rStyle w:val="PlaceholderText"/>
             </w:rPr>
             <w:t>Haga clic o pulse aquí para escribir texto.</w:t>
           </w:r>
@@ -10875,7 +10563,7 @@
           </w:pPr>
           <w:r>
             <w:rPr>
-              <w:rStyle w:val="Textodelmarcadordeposicin"/>
+              <w:rStyle w:val="PlaceholderText"/>
             </w:rPr>
             <w:t>Haga clic o pulse aquí para escribir texto.</w:t>
           </w:r>
@@ -10904,7 +10592,7 @@
           </w:pPr>
           <w:r>
             <w:rPr>
-              <w:rStyle w:val="Textodelmarcadordeposicin"/>
+              <w:rStyle w:val="PlaceholderText"/>
             </w:rPr>
             <w:t>Haga clic o pulse aquí para escribir texto.</w:t>
           </w:r>
@@ -10933,7 +10621,7 @@
           </w:pPr>
           <w:r>
             <w:rPr>
-              <w:rStyle w:val="Textodelmarcadordeposicin"/>
+              <w:rStyle w:val="PlaceholderText"/>
             </w:rPr>
             <w:t>Haga clic o pulse aquí para escribir texto.</w:t>
           </w:r>
@@ -10962,7 +10650,7 @@
           </w:pPr>
           <w:r>
             <w:rPr>
-              <w:rStyle w:val="Textodelmarcadordeposicin"/>
+              <w:rStyle w:val="PlaceholderText"/>
             </w:rPr>
             <w:t>Haga clic o pulse aquí para escribir texto.</w:t>
           </w:r>
@@ -10991,7 +10679,7 @@
           </w:pPr>
           <w:r>
             <w:rPr>
-              <w:rStyle w:val="Textodelmarcadordeposicin"/>
+              <w:rStyle w:val="PlaceholderText"/>
             </w:rPr>
             <w:t>Haga clic o pulse aquí para escribir texto.</w:t>
           </w:r>
@@ -11020,7 +10708,7 @@
           </w:pPr>
           <w:r>
             <w:rPr>
-              <w:rStyle w:val="Textodelmarcadordeposicin"/>
+              <w:rStyle w:val="PlaceholderText"/>
             </w:rPr>
             <w:t>Haga clic o pulse aquí para escribir texto.</w:t>
           </w:r>
@@ -11049,7 +10737,7 @@
           </w:pPr>
           <w:r>
             <w:rPr>
-              <w:rStyle w:val="Textodelmarcadordeposicin"/>
+              <w:rStyle w:val="PlaceholderText"/>
             </w:rPr>
             <w:t>Haga clic o pulse aquí para escribir texto.</w:t>
           </w:r>
@@ -11078,7 +10766,7 @@
           </w:pPr>
           <w:r>
             <w:rPr>
-              <w:rStyle w:val="Textodelmarcadordeposicin"/>
+              <w:rStyle w:val="PlaceholderText"/>
             </w:rPr>
             <w:t>Haga clic o pulse aquí para escribir texto.</w:t>
           </w:r>
@@ -11107,7 +10795,7 @@
           </w:pPr>
           <w:r>
             <w:rPr>
-              <w:rStyle w:val="Textodelmarcadordeposicin"/>
+              <w:rStyle w:val="PlaceholderText"/>
             </w:rPr>
             <w:t>Haga clic o pulse aquí para escribir texto.</w:t>
           </w:r>
@@ -11136,7 +10824,7 @@
           </w:pPr>
           <w:r>
             <w:rPr>
-              <w:rStyle w:val="Textodelmarcadordeposicin"/>
+              <w:rStyle w:val="PlaceholderText"/>
             </w:rPr>
             <w:t>Haga clic o pulse aquí para escribir texto.</w:t>
           </w:r>
@@ -11165,7 +10853,7 @@
           </w:pPr>
           <w:r>
             <w:rPr>
-              <w:rStyle w:val="Textodelmarcadordeposicin"/>
+              <w:rStyle w:val="PlaceholderText"/>
             </w:rPr>
             <w:t>Haga clic o pulse aquí para escribir texto.</w:t>
           </w:r>
@@ -11194,7 +10882,7 @@
           </w:pPr>
           <w:r>
             <w:rPr>
-              <w:rStyle w:val="Textodelmarcadordeposicin"/>
+              <w:rStyle w:val="PlaceholderText"/>
             </w:rPr>
             <w:t>Haga clic o pulse aquí para escribir texto.</w:t>
           </w:r>
@@ -11223,7 +10911,7 @@
           </w:pPr>
           <w:r>
             <w:rPr>
-              <w:rStyle w:val="Textodelmarcadordeposicin"/>
+              <w:rStyle w:val="PlaceholderText"/>
             </w:rPr>
             <w:t>Haga clic o pulse aquí para escribir texto.</w:t>
           </w:r>
@@ -11252,7 +10940,7 @@
           </w:pPr>
           <w:r>
             <w:rPr>
-              <w:rStyle w:val="Textodelmarcadordeposicin"/>
+              <w:rStyle w:val="PlaceholderText"/>
             </w:rPr>
             <w:t>Haga clic o pulse aquí para escribir texto.</w:t>
           </w:r>
@@ -11281,7 +10969,7 @@
           </w:pPr>
           <w:r>
             <w:rPr>
-              <w:rStyle w:val="Textodelmarcadordeposicin"/>
+              <w:rStyle w:val="PlaceholderText"/>
             </w:rPr>
             <w:t>Haga clic o pulse aquí para escribir texto.</w:t>
           </w:r>
@@ -11310,7 +10998,7 @@
           </w:pPr>
           <w:r>
             <w:rPr>
-              <w:rStyle w:val="Textodelmarcadordeposicin"/>
+              <w:rStyle w:val="PlaceholderText"/>
             </w:rPr>
             <w:t>Haga clic o pulse aquí para escribir texto.</w:t>
           </w:r>
@@ -11339,7 +11027,7 @@
           </w:pPr>
           <w:r>
             <w:rPr>
-              <w:rStyle w:val="Textodelmarcadordeposicin"/>
+              <w:rStyle w:val="PlaceholderText"/>
             </w:rPr>
             <w:t>Haga clic o pulse aquí para escribir texto.</w:t>
           </w:r>
@@ -11368,7 +11056,7 @@
           </w:pPr>
           <w:r>
             <w:rPr>
-              <w:rStyle w:val="Textodelmarcadordeposicin"/>
+              <w:rStyle w:val="PlaceholderText"/>
             </w:rPr>
             <w:t>Haga clic o pulse aquí para escribir texto.</w:t>
           </w:r>
@@ -11512,6 +11200,7 @@
     <w:rsid w:val="000B5C7E"/>
     <w:rsid w:val="00117B5F"/>
     <w:rsid w:val="001315AF"/>
+    <w:rsid w:val="00132C51"/>
     <w:rsid w:val="001724DF"/>
     <w:rsid w:val="00175D09"/>
     <w:rsid w:val="00185460"/>
@@ -11519,6 +11208,7 @@
     <w:rsid w:val="001C5FFF"/>
     <w:rsid w:val="00260AAC"/>
     <w:rsid w:val="002D13EB"/>
+    <w:rsid w:val="00316085"/>
     <w:rsid w:val="00336824"/>
     <w:rsid w:val="00336917"/>
     <w:rsid w:val="00340CDF"/>
@@ -11554,6 +11244,7 @@
     <w:rsid w:val="006B2BEC"/>
     <w:rsid w:val="006F209A"/>
     <w:rsid w:val="0072683A"/>
+    <w:rsid w:val="00732C71"/>
     <w:rsid w:val="00765401"/>
     <w:rsid w:val="007833DE"/>
     <w:rsid w:val="00790E22"/>
@@ -11579,6 +11270,7 @@
     <w:rsid w:val="00AC1FAB"/>
     <w:rsid w:val="00AD1FDD"/>
     <w:rsid w:val="00B55352"/>
+    <w:rsid w:val="00B57BB7"/>
     <w:rsid w:val="00BB0EAB"/>
     <w:rsid w:val="00C17266"/>
     <w:rsid w:val="00C2692D"/>
@@ -12028,13 +11720,13 @@
     <w:name w:val="Normal"/>
     <w:qFormat/>
   </w:style>
-  <w:style w:type="character" w:default="1" w:styleId="Fuentedeprrafopredeter">
+  <w:style w:type="character" w:default="1" w:styleId="DefaultParagraphFont">
     <w:name w:val="Default Paragraph Font"/>
     <w:uiPriority w:val="1"/>
     <w:semiHidden/>
     <w:unhideWhenUsed/>
   </w:style>
-  <w:style w:type="table" w:default="1" w:styleId="Tablanormal">
+  <w:style w:type="table" w:default="1" w:styleId="TableNormal">
     <w:name w:val="Normal Table"/>
     <w:uiPriority w:val="99"/>
     <w:semiHidden/>
@@ -12049,15 +11741,15 @@
       </w:tblCellMar>
     </w:tblPr>
   </w:style>
-  <w:style w:type="numbering" w:default="1" w:styleId="Sinlista">
+  <w:style w:type="numbering" w:default="1" w:styleId="NoList">
     <w:name w:val="No List"/>
     <w:uiPriority w:val="99"/>
     <w:semiHidden/>
     <w:unhideWhenUsed/>
   </w:style>
-  <w:style w:type="character" w:styleId="Textodelmarcadordeposicin">
+  <w:style w:type="character" w:styleId="PlaceholderText">
     <w:name w:val="Placeholder Text"/>
-    <w:basedOn w:val="Fuentedeprrafopredeter"/>
+    <w:basedOn w:val="DefaultParagraphFont"/>
     <w:uiPriority w:val="99"/>
     <w:semiHidden/>
     <w:rsid w:val="002D13EB"/>
@@ -13322,16 +13014,12 @@
 </file>
 
 <file path=customXml/item1.xml><?xml version="1.0" encoding="utf-8"?>
-<b:Sources xmlns:b="http://schemas.openxmlformats.org/officeDocument/2006/bibliography" xmlns="http://schemas.openxmlformats.org/officeDocument/2006/bibliography" SelectedStyle="\APASixthEditionOfficeOnline.xsl" StyleName="APA" Version="6"/>
-</file>
-
-<file path=customXml/item2.xml><?xml version="1.0" encoding="utf-8"?>
 <p:properties xmlns:p="http://schemas.microsoft.com/office/2006/metadata/properties" xmlns:xsi="http://www.w3.org/2001/XMLSchema-instance" xmlns:pc="http://schemas.microsoft.com/office/infopath/2007/PartnerControls">
   <documentManagement/>
 </p:properties>
 </file>
 
-<file path=customXml/item3.xml><?xml version="1.0" encoding="utf-8"?>
+<file path=customXml/item2.xml><?xml version="1.0" encoding="utf-8"?>
 <ct:contentTypeSchema xmlns:ct="http://schemas.microsoft.com/office/2006/metadata/contentType" xmlns:ma="http://schemas.microsoft.com/office/2006/metadata/properties/metaAttributes" ct:_="" ma:_="" ma:contentTypeName="Document" ma:contentTypeID="0x0101005494D85DF9FF9349870FD0FBC477A908" ma:contentTypeVersion="0" ma:contentTypeDescription="Create a new document." ma:contentTypeScope="" ma:versionID="b8cabc771eab0fbe38000bfb2feb6fe2">
   <xsd:schema xmlns:xsd="http://www.w3.org/2001/XMLSchema" xmlns:xs="http://www.w3.org/2001/XMLSchema" xmlns:p="http://schemas.microsoft.com/office/2006/metadata/properties" targetNamespace="http://schemas.microsoft.com/office/2006/metadata/properties" ma:root="true" ma:fieldsID="b764bea3eb9b1a5be8fd57fac5fb459b">
     <xsd:element name="properties">
@@ -13445,7 +13133,7 @@
 </ct:contentTypeSchema>
 </file>
 
-<file path=customXml/item4.xml><?xml version="1.0" encoding="utf-8"?>
+<file path=customXml/item3.xml><?xml version="1.0" encoding="utf-8"?>
 <?mso-contentType ?>
 <FormTemplates xmlns="http://schemas.microsoft.com/sharepoint/v3/contenttype/forms">
   <Display>DocumentLibraryForm</Display>
@@ -13454,15 +13142,11 @@
 </FormTemplates>
 </file>
 
-<file path=customXml/itemProps1.xml><?xml version="1.0" encoding="utf-8"?>
-<ds:datastoreItem xmlns:ds="http://schemas.openxmlformats.org/officeDocument/2006/customXml" ds:itemID="{DACBA2D3-B54D-4E9B-B06E-39CB1345C0EE}">
-  <ds:schemaRefs>
-    <ds:schemaRef ds:uri="http://schemas.openxmlformats.org/officeDocument/2006/bibliography"/>
-  </ds:schemaRefs>
-</ds:datastoreItem>
+<file path=customXml/item4.xml><?xml version="1.0" encoding="utf-8"?>
+<b:Sources xmlns:b="http://schemas.openxmlformats.org/officeDocument/2006/bibliography" xmlns="http://schemas.openxmlformats.org/officeDocument/2006/bibliography" SelectedStyle="\APASixthEditionOfficeOnline.xsl" StyleName="APA" Version="6"/>
 </file>
 
-<file path=customXml/itemProps2.xml><?xml version="1.0" encoding="utf-8"?>
+<file path=customXml/itemProps1.xml><?xml version="1.0" encoding="utf-8"?>
 <ds:datastoreItem xmlns:ds="http://schemas.openxmlformats.org/officeDocument/2006/customXml" ds:itemID="{C93F8699-E48F-4CDA-AEC5-D69EA27208D5}">
   <ds:schemaRefs>
     <ds:schemaRef ds:uri="http://schemas.microsoft.com/office/2006/metadata/properties"/>
@@ -13471,7 +13155,7 @@
 </ds:datastoreItem>
 </file>
 
-<file path=customXml/itemProps3.xml><?xml version="1.0" encoding="utf-8"?>
+<file path=customXml/itemProps2.xml><?xml version="1.0" encoding="utf-8"?>
 <ds:datastoreItem xmlns:ds="http://schemas.openxmlformats.org/officeDocument/2006/customXml" ds:itemID="{0699A236-4A9F-4A3A-ABBC-25F2D3C9D2E5}">
   <ds:schemaRefs>
     <ds:schemaRef ds:uri="http://schemas.microsoft.com/office/2006/metadata/contentType"/>
@@ -13487,10 +13171,18 @@
 </ds:datastoreItem>
 </file>
 
-<file path=customXml/itemProps4.xml><?xml version="1.0" encoding="utf-8"?>
+<file path=customXml/itemProps3.xml><?xml version="1.0" encoding="utf-8"?>
 <ds:datastoreItem xmlns:ds="http://schemas.openxmlformats.org/officeDocument/2006/customXml" ds:itemID="{54DFF3D6-E673-4AE5-BBB5-825C70E182EB}">
   <ds:schemaRefs>
     <ds:schemaRef ds:uri="http://schemas.microsoft.com/sharepoint/v3/contenttype/forms"/>
   </ds:schemaRefs>
 </ds:datastoreItem>
+</file>
+
+<file path=customXml/itemProps4.xml><?xml version="1.0" encoding="utf-8"?>
+<ds:datastoreItem xmlns:ds="http://schemas.openxmlformats.org/officeDocument/2006/customXml" ds:itemID="{DACBA2D3-B54D-4E9B-B06E-39CB1345C0EE}">
+  <ds:schemaRefs>
+    <ds:schemaRef ds:uri="http://schemas.openxmlformats.org/officeDocument/2006/bibliography"/>
+  </ds:schemaRefs>
+</ds:datastoreItem>
 </file>
</xml_diff>